<commit_message>
Enablement Word copies: version 2.0 rebuilt after review round three
Co-Authored-By: Claude Fable 5.1 <noreply@anthropic.com>
</commit_message>
<xml_diff>
--- a/docs/enablement/word/Enablement-Glossary-v2.0.docx
+++ b/docs/enablement/word/Enablement-Glossary-v2.0.docx
@@ -536,7 +536,7 @@
               <w:rPr>
                 <w:rStyle w:val="IndexLink"/>
               </w:rPr>
-              <w:t xml:space="default">H</w:t>
+              <w:t xml:space="default">G</w:t>
               <w:tab/>
               <w:t xml:space="default"/>
             </w:r>
@@ -555,7 +555,7 @@
               <w:rPr>
                 <w:rStyle w:val="IndexLink"/>
               </w:rPr>
-              <w:t xml:space="default">I</w:t>
+              <w:t xml:space="default">H</w:t>
               <w:tab/>
               <w:t xml:space="default"/>
             </w:r>
@@ -574,7 +574,7 @@
               <w:rPr>
                 <w:rStyle w:val="IndexLink"/>
               </w:rPr>
-              <w:t xml:space="default">J</w:t>
+              <w:t xml:space="default">I</w:t>
               <w:tab/>
               <w:t xml:space="default"/>
             </w:r>
@@ -593,7 +593,7 @@
               <w:rPr>
                 <w:rStyle w:val="IndexLink"/>
               </w:rPr>
-              <w:t xml:space="default">K</w:t>
+              <w:t xml:space="default">J</w:t>
               <w:tab/>
               <w:t xml:space="default"/>
             </w:r>
@@ -612,7 +612,7 @@
               <w:rPr>
                 <w:rStyle w:val="IndexLink"/>
               </w:rPr>
-              <w:t xml:space="default">L</w:t>
+              <w:t xml:space="default">K</w:t>
               <w:tab/>
               <w:t xml:space="default"/>
             </w:r>
@@ -631,7 +631,7 @@
               <w:rPr>
                 <w:rStyle w:val="IndexLink"/>
               </w:rPr>
-              <w:t xml:space="default">M</w:t>
+              <w:t xml:space="default">L</w:t>
               <w:tab/>
               <w:t xml:space="default"/>
             </w:r>
@@ -650,7 +650,7 @@
               <w:rPr>
                 <w:rStyle w:val="IndexLink"/>
               </w:rPr>
-              <w:t xml:space="default">O</w:t>
+              <w:t xml:space="default">M</w:t>
               <w:tab/>
               <w:t xml:space="default"/>
             </w:r>
@@ -669,7 +669,7 @@
               <w:rPr>
                 <w:rStyle w:val="IndexLink"/>
               </w:rPr>
-              <w:t xml:space="default">P</w:t>
+              <w:t xml:space="default">O</w:t>
               <w:tab/>
               <w:t xml:space="default"/>
             </w:r>
@@ -688,7 +688,7 @@
               <w:rPr>
                 <w:rStyle w:val="IndexLink"/>
               </w:rPr>
-              <w:t xml:space="default">Q</w:t>
+              <w:t xml:space="default">P</w:t>
               <w:tab/>
               <w:t xml:space="default"/>
             </w:r>
@@ -707,7 +707,7 @@
               <w:rPr>
                 <w:rStyle w:val="IndexLink"/>
               </w:rPr>
-              <w:t xml:space="default">R</w:t>
+              <w:t xml:space="default">Q</w:t>
               <w:tab/>
               <w:t xml:space="default"/>
             </w:r>
@@ -726,7 +726,7 @@
               <w:rPr>
                 <w:rStyle w:val="IndexLink"/>
               </w:rPr>
-              <w:t xml:space="default">S</w:t>
+              <w:t xml:space="default">R</w:t>
               <w:tab/>
               <w:t xml:space="default"/>
             </w:r>
@@ -745,7 +745,7 @@
               <w:rPr>
                 <w:rStyle w:val="IndexLink"/>
               </w:rPr>
-              <w:t xml:space="default">T</w:t>
+              <w:t xml:space="default">S</w:t>
               <w:tab/>
               <w:t xml:space="default"/>
             </w:r>
@@ -764,6 +764,25 @@
               <w:rPr>
                 <w:rStyle w:val="IndexLink"/>
               </w:rPr>
+              <w:t xml:space="default">T</w:t>
+              <w:tab/>
+              <w:t xml:space="default"/>
+            </w:r>
+          </w:hyperlink>
+        </w:p>
+        <w:p>
+          <w:pPr>
+            <w:pStyle w:val="TOC2"/>
+            <w:tabs>
+              <w:tab w:val="clear" w:pos="8786"/>
+              <w:tab w:val="right" w:pos="9025" w:leader="dot"/>
+            </w:tabs>
+          </w:pPr>
+          <w:hyperlink w:history="1" w:anchor="sec21">
+            <w:r>
+              <w:rPr>
+                <w:rStyle w:val="IndexLink"/>
+              </w:rPr>
               <w:t xml:space="default">V</w:t>
               <w:tab/>
               <w:t xml:space="default"/>
@@ -778,7 +797,7 @@
               <w:tab w:val="right" w:pos="9025" w:leader="dot"/>
             </w:tabs>
           </w:pPr>
-          <w:hyperlink w:history="1" w:anchor="sec21">
+          <w:hyperlink w:history="1" w:anchor="sec22">
             <w:r>
               <w:rPr>
                 <w:rStyle w:val="IndexLink"/>
@@ -2226,7 +2245,7 @@
           <w:sz w:val="25"/>
           <w:szCs w:val="25"/>
         </w:rPr>
-        <w:t xml:space="preserve">H</w:t>
+        <w:t xml:space="preserve">G</w:t>
       </w:r>
       <w:bookmarkEnd w:id="8"/>
     </w:p>
@@ -2243,41 +2262,16 @@
           <w:sz w:val="21"/>
           <w:szCs w:val="21"/>
         </w:rPr>
-        <w:t xml:space="preserve">Half-life.</w:t>
-      </w:r>
-      <w:r>
-        <w:rPr>
-          <w:rFonts w:ascii="Calibri" w:cs="Calibri" w:eastAsia="Calibri" w:hAnsi="Calibri"/>
-          <w:color w:val="1A1A1A"/>
-          <w:sz w:val="21"/>
-          <w:szCs w:val="21"/>
-        </w:rPr>
-        <w:t xml:space="preserve"> Deprecated as a name for the memory (τ), which is a time constant, not a half-life. The evidence behind an interest halves in about 0.69 times τ, about 9.7 days at the default memory of 14 days.</w:t>
-      </w:r>
-    </w:p>
-    <w:p>
-      <w:pPr>
-        <w:spacing w:after="120" w:line="276"/>
-      </w:pPr>
-      <w:r>
-        <w:rPr>
-          <w:rFonts w:ascii="Calibri" w:cs="Calibri" w:eastAsia="Calibri" w:hAnsi="Calibri"/>
-          <w:b/>
-          <w:bCs/>
-          <w:color w:val="1A1A1A"/>
-          <w:sz w:val="21"/>
-          <w:szCs w:val="21"/>
-        </w:rPr>
-        <w:t xml:space="preserve">Holdout.</w:t>
-      </w:r>
-      <w:r>
-        <w:rPr>
-          <w:rFonts w:ascii="Calibri" w:cs="Calibri" w:eastAsia="Calibri" w:hAnsi="Calibri"/>
-          <w:color w:val="1A1A1A"/>
-          <w:sz w:val="21"/>
-          <w:szCs w:val="21"/>
-        </w:rPr>
-        <w:t xml:space="preserve"> A share of visitors kept out on purpose so there is always something to compare against: they see the site's own defaults, or personalization without learning. Assignment is stable per visitor and draws only visitors who consented, and the brand measures lift by comparing the groups on its own numbers.</w:t>
+        <w:t xml:space="preserve">Gate.</w:t>
+      </w:r>
+      <w:r>
+        <w:rPr>
+          <w:rFonts w:ascii="Calibri" w:cs="Calibri" w:eastAsia="Calibri" w:hAnsi="Calibri"/>
+          <w:color w:val="1A1A1A"/>
+          <w:sz w:val="21"/>
+          <w:szCs w:val="21"/>
+        </w:rPr>
+        <w:t xml:space="preserve"> A rule that removes what may not show before anything is ranked: a piece out of stock, outside its window or outside its region, or one the slot excludes. Gates run first, then pins, then ranking, and the receipt names which of the three decided each place. A pinned piece that a gate removes is simply not shown, and the rest of the slot ranks as usual.</w:t>
       </w:r>
     </w:p>
     <w:p>
@@ -2295,7 +2289,7 @@
           <w:sz w:val="25"/>
           <w:szCs w:val="25"/>
         </w:rPr>
-        <w:t xml:space="preserve">I</w:t>
+        <w:t xml:space="preserve">H</w:t>
       </w:r>
       <w:bookmarkEnd w:id="9"/>
     </w:p>
@@ -2312,41 +2306,41 @@
           <w:sz w:val="21"/>
           <w:szCs w:val="21"/>
         </w:rPr>
-        <w:t xml:space="preserve">Intelligence.</w:t>
-      </w:r>
-      <w:r>
-        <w:rPr>
-          <w:rFonts w:ascii="Calibri" w:cs="Calibri" w:eastAsia="Calibri" w:hAnsi="Calibri"/>
-          <w:color w:val="1A1A1A"/>
-          <w:sz w:val="21"/>
-          <w:szCs w:val="21"/>
-        </w:rPr>
-        <w:t xml:space="preserve"> The second half of the package's name: counted learning behind a dial, never AI. The engine counts which pieces earn outcomes and changes nothing until a person raises the learning dial.</w:t>
-      </w:r>
-    </w:p>
-    <w:p>
-      <w:pPr>
-        <w:spacing w:after="120" w:line="276"/>
-      </w:pPr>
-      <w:r>
-        <w:rPr>
-          <w:rFonts w:ascii="Calibri" w:cs="Calibri" w:eastAsia="Calibri" w:hAnsi="Calibri"/>
-          <w:b/>
-          <w:bCs/>
-          <w:color w:val="1A1A1A"/>
-          <w:sz w:val="21"/>
-          <w:szCs w:val="21"/>
-        </w:rPr>
-        <w:t xml:space="preserve">Interest.</w:t>
-      </w:r>
-      <w:r>
-        <w:rPr>
-          <w:rFonts w:ascii="Calibri" w:cs="Calibri" w:eastAsia="Calibri" w:hAnsi="Calibri"/>
-          <w:color w:val="1A1A1A"/>
-          <w:sz w:val="21"/>
-          <w:szCs w:val="21"/>
-        </w:rPr>
-        <w:t xml:space="preserve"> How strongly a visitor leans toward one dimension value, from 0 up to just under 1, filling like a bucket with their own actions and draining with time. It is a quantity, not a yes or no; an audience is the yes or no drawn from it. The code and older material say affinity.</w:t>
+        <w:t xml:space="preserve">Half-life.</w:t>
+      </w:r>
+      <w:r>
+        <w:rPr>
+          <w:rFonts w:ascii="Calibri" w:cs="Calibri" w:eastAsia="Calibri" w:hAnsi="Calibri"/>
+          <w:color w:val="1A1A1A"/>
+          <w:sz w:val="21"/>
+          <w:szCs w:val="21"/>
+        </w:rPr>
+        <w:t xml:space="preserve"> Deprecated as a name for the memory (τ), which is a time constant, not a half-life. The evidence behind an interest halves in about 0.69 times τ, about 9.7 days at the default memory of 14 days.</w:t>
+      </w:r>
+    </w:p>
+    <w:p>
+      <w:pPr>
+        <w:spacing w:after="120" w:line="276"/>
+      </w:pPr>
+      <w:r>
+        <w:rPr>
+          <w:rFonts w:ascii="Calibri" w:cs="Calibri" w:eastAsia="Calibri" w:hAnsi="Calibri"/>
+          <w:b/>
+          <w:bCs/>
+          <w:color w:val="1A1A1A"/>
+          <w:sz w:val="21"/>
+          <w:szCs w:val="21"/>
+        </w:rPr>
+        <w:t xml:space="preserve">Holdout.</w:t>
+      </w:r>
+      <w:r>
+        <w:rPr>
+          <w:rFonts w:ascii="Calibri" w:cs="Calibri" w:eastAsia="Calibri" w:hAnsi="Calibri"/>
+          <w:color w:val="1A1A1A"/>
+          <w:sz w:val="21"/>
+          <w:szCs w:val="21"/>
+        </w:rPr>
+        <w:t xml:space="preserve"> A share of visitors kept out on purpose so there is always something to compare against: they see the site's own defaults, or personalization without learning. Assignment is stable per visitor and draws only visitors who consented, and the brand measures lift by comparing the groups on its own numbers.</w:t>
       </w:r>
     </w:p>
     <w:p>
@@ -2364,7 +2358,7 @@
           <w:sz w:val="25"/>
           <w:szCs w:val="25"/>
         </w:rPr>
-        <w:t xml:space="preserve">J</w:t>
+        <w:t xml:space="preserve">I</w:t>
       </w:r>
       <w:bookmarkEnd w:id="10"/>
     </w:p>
@@ -2381,16 +2375,41 @@
           <w:sz w:val="21"/>
           <w:szCs w:val="21"/>
         </w:rPr>
-        <w:t xml:space="preserve">Journey stage.</w:t>
-      </w:r>
-      <w:r>
-        <w:rPr>
-          <w:rFonts w:ascii="Calibri" w:cs="Calibri" w:eastAsia="Calibri" w:hAnsi="Calibri"/>
-          <w:color w:val="1A1A1A"/>
-          <w:sz w:val="21"/>
-          <w:szCs w:val="21"/>
-        </w:rPr>
-        <w:t xml:space="preserve"> Where a visitor is within a visit: exploring, then considering, then deciding, with the middle one reported as thinking. By default a visitor reaches considering at their third interaction and deciding at their first purchase, and the brand can publish its own thresholds.</w:t>
+        <w:t xml:space="preserve">Intelligence.</w:t>
+      </w:r>
+      <w:r>
+        <w:rPr>
+          <w:rFonts w:ascii="Calibri" w:cs="Calibri" w:eastAsia="Calibri" w:hAnsi="Calibri"/>
+          <w:color w:val="1A1A1A"/>
+          <w:sz w:val="21"/>
+          <w:szCs w:val="21"/>
+        </w:rPr>
+        <w:t xml:space="preserve"> The second half of the package's name: counted learning behind a dial, never AI. The engine counts which pieces earn outcomes and changes nothing until a person raises the learning dial.</w:t>
+      </w:r>
+    </w:p>
+    <w:p>
+      <w:pPr>
+        <w:spacing w:after="120" w:line="276"/>
+      </w:pPr>
+      <w:r>
+        <w:rPr>
+          <w:rFonts w:ascii="Calibri" w:cs="Calibri" w:eastAsia="Calibri" w:hAnsi="Calibri"/>
+          <w:b/>
+          <w:bCs/>
+          <w:color w:val="1A1A1A"/>
+          <w:sz w:val="21"/>
+          <w:szCs w:val="21"/>
+        </w:rPr>
+        <w:t xml:space="preserve">Interest.</w:t>
+      </w:r>
+      <w:r>
+        <w:rPr>
+          <w:rFonts w:ascii="Calibri" w:cs="Calibri" w:eastAsia="Calibri" w:hAnsi="Calibri"/>
+          <w:color w:val="1A1A1A"/>
+          <w:sz w:val="21"/>
+          <w:szCs w:val="21"/>
+        </w:rPr>
+        <w:t xml:space="preserve"> How strongly a visitor leans toward one dimension value, from 0 up to just under 1, filling like a bucket with their own actions and draining with time. It is a quantity, not a yes or no; an audience is the yes or no drawn from it. The code and older material say affinity.</w:t>
       </w:r>
     </w:p>
     <w:p>
@@ -2408,7 +2427,7 @@
           <w:sz w:val="25"/>
           <w:szCs w:val="25"/>
         </w:rPr>
-        <w:t xml:space="preserve">K</w:t>
+        <w:t xml:space="preserve">J</w:t>
       </w:r>
       <w:bookmarkEnd w:id="11"/>
     </w:p>
@@ -2425,41 +2444,16 @@
           <w:sz w:val="21"/>
           <w:szCs w:val="21"/>
         </w:rPr>
-        <w:t xml:space="preserve">K.</w:t>
-      </w:r>
-      <w:r>
-        <w:rPr>
-          <w:rFonts w:ascii="Calibri" w:cs="Calibri" w:eastAsia="Calibri" w:hAnsi="Calibri"/>
-          <w:color w:val="1A1A1A"/>
-          <w:sz w:val="21"/>
-          <w:szCs w:val="21"/>
-        </w:rPr>
-        <w:t xml:space="preserve"> How much evidence makes an interest half-strength: at the default of 1.8, interest reaches 0.5 when the raw score reaches 1.8. With each view weighted 1, one view gives 0.357, two give 0.526 and three give 0.625, enough to join an audience.</w:t>
-      </w:r>
-    </w:p>
-    <w:p>
-      <w:pPr>
-        <w:spacing w:after="120" w:line="276"/>
-      </w:pPr>
-      <w:r>
-        <w:rPr>
-          <w:rFonts w:ascii="Calibri" w:cs="Calibri" w:eastAsia="Calibri" w:hAnsi="Calibri"/>
-          <w:b/>
-          <w:bCs/>
-          <w:color w:val="1A1A1A"/>
-          <w:sz w:val="21"/>
-          <w:szCs w:val="21"/>
-        </w:rPr>
-        <w:t xml:space="preserve">KV.</w:t>
-      </w:r>
-      <w:r>
-        <w:rPr>
-          <w:rFonts w:ascii="Calibri" w:cs="Calibri" w:eastAsia="Calibri" w:hAnsi="Calibri"/>
-          <w:color w:val="1A1A1A"/>
-          <w:sz w:val="21"/>
-          <w:szCs w:val="21"/>
-        </w:rPr>
-        <w:t xml:space="preserve"> Cloudflare's key-value store: fast reads, with writes that take a short while to reach every location. The engine keeps visitor records and published snapshots there.</w:t>
+        <w:t xml:space="preserve">Journey stage.</w:t>
+      </w:r>
+      <w:r>
+        <w:rPr>
+          <w:rFonts w:ascii="Calibri" w:cs="Calibri" w:eastAsia="Calibri" w:hAnsi="Calibri"/>
+          <w:color w:val="1A1A1A"/>
+          <w:sz w:val="21"/>
+          <w:szCs w:val="21"/>
+        </w:rPr>
+        <w:t xml:space="preserve"> Where a visitor is within a visit: exploring, then considering, then deciding, with the middle one reported as thinking. By default a visitor reaches considering at their third interaction and deciding at their first purchase, and the brand can publish its own thresholds.</w:t>
       </w:r>
     </w:p>
     <w:p>
@@ -2477,7 +2471,7 @@
           <w:sz w:val="25"/>
           <w:szCs w:val="25"/>
         </w:rPr>
-        <w:t xml:space="preserve">L</w:t>
+        <w:t xml:space="preserve">K</w:t>
       </w:r>
       <w:bookmarkEnd w:id="12"/>
     </w:p>
@@ -2494,141 +2488,41 @@
           <w:sz w:val="21"/>
           <w:szCs w:val="21"/>
         </w:rPr>
-        <w:t xml:space="preserve">Ladder.</w:t>
-      </w:r>
-      <w:r>
-        <w:rPr>
-          <w:rFonts w:ascii="Calibri" w:cs="Calibri" w:eastAsia="Calibri" w:hAnsi="Calibri"/>
-          <w:color w:val="1A1A1A"/>
-          <w:sz w:val="21"/>
-          <w:szCs w:val="21"/>
-        </w:rPr>
-        <w:t xml:space="preserve"> Deprecated: older material uses it for three different things. Say regional fallback for region, then country, then everyone; pooling levels for how learning widens its evidence; and never use it for a sequence of offerings.</w:t>
-      </w:r>
-    </w:p>
-    <w:p>
-      <w:pPr>
-        <w:spacing w:after="120" w:line="276"/>
-      </w:pPr>
-      <w:r>
-        <w:rPr>
-          <w:rFonts w:ascii="Calibri" w:cs="Calibri" w:eastAsia="Calibri" w:hAnsi="Calibri"/>
-          <w:b/>
-          <w:bCs/>
-          <w:color w:val="1A1A1A"/>
-          <w:sz w:val="21"/>
-          <w:szCs w:val="21"/>
-        </w:rPr>
-        <w:t xml:space="preserve">Learn document.</w:t>
-      </w:r>
-      <w:r>
-        <w:rPr>
-          <w:rFonts w:ascii="Calibri" w:cs="Calibri" w:eastAsia="Calibri" w:hAnsi="Calibri"/>
-          <w:color w:val="1A1A1A"/>
-          <w:sz w:val="21"/>
-          <w:szCs w:val="21"/>
-        </w:rPr>
-        <w:t xml:space="preserve"> The published document that holds the learning and measurement settings: the learning dial for each slot, the holdout, the regional prior, the attribution windows and exploration.</w:t>
-      </w:r>
-    </w:p>
-    <w:p>
-      <w:pPr>
-        <w:spacing w:after="120" w:line="276"/>
-      </w:pPr>
-      <w:r>
-        <w:rPr>
-          <w:rFonts w:ascii="Calibri" w:cs="Calibri" w:eastAsia="Calibri" w:hAnsi="Calibri"/>
-          <w:b/>
-          <w:bCs/>
-          <w:color w:val="1A1A1A"/>
-          <w:sz w:val="21"/>
-          <w:szCs w:val="21"/>
-        </w:rPr>
-        <w:t xml:space="preserve">Learning.</w:t>
-      </w:r>
-      <w:r>
-        <w:rPr>
-          <w:rFonts w:ascii="Calibri" w:cs="Calibri" w:eastAsia="Calibri" w:hAnsi="Calibri"/>
-          <w:color w:val="1A1A1A"/>
-          <w:sz w:val="21"/>
-          <w:szCs w:val="21"/>
-        </w:rPr>
-        <w:t xml:space="preserve"> Counting which pieces earn outcomes in which contexts, so that what works can move a piece's score; in this package the word never means building a visitor's interests. It is counting, never AI. It records what works from the first day and changes nothing until the brand turns the dial.</w:t>
-      </w:r>
-    </w:p>
-    <w:p>
-      <w:pPr>
-        <w:spacing w:after="120" w:line="276"/>
-      </w:pPr>
-      <w:r>
-        <w:rPr>
-          <w:rFonts w:ascii="Calibri" w:cs="Calibri" w:eastAsia="Calibri" w:hAnsi="Calibri"/>
-          <w:b/>
-          <w:bCs/>
-          <w:color w:val="1A1A1A"/>
-          <w:sz w:val="21"/>
-          <w:szCs w:val="21"/>
-        </w:rPr>
-        <w:t xml:space="preserve">Learning dial (γ).</w:t>
-      </w:r>
-      <w:r>
-        <w:rPr>
-          <w:rFonts w:ascii="Calibri" w:cs="Calibri" w:eastAsia="Calibri" w:hAnsi="Calibri"/>
-          <w:color w:val="1A1A1A"/>
-          <w:sz w:val="21"/>
-          <w:szCs w:val="21"/>
-        </w:rPr>
-        <w:t xml:space="preserve"> The setting on each slot, from 0 to 1, that decides how much learning may move its scores. It starts at 0, so what is learned moves nothing until a person raises it. Older material calls it the trust dial.</w:t>
-      </w:r>
-    </w:p>
-    <w:p>
-      <w:pPr>
-        <w:spacing w:after="120" w:line="276"/>
-      </w:pPr>
-      <w:r>
-        <w:rPr>
-          <w:rFonts w:ascii="Calibri" w:cs="Calibri" w:eastAsia="Calibri" w:hAnsi="Calibri"/>
-          <w:b/>
-          <w:bCs/>
-          <w:color w:val="1A1A1A"/>
-          <w:sz w:val="21"/>
-          <w:szCs w:val="21"/>
-        </w:rPr>
-        <w:t xml:space="preserve">Ledger.</w:t>
-      </w:r>
-      <w:r>
-        <w:rPr>
-          <w:rFonts w:ascii="Calibri" w:cs="Calibri" w:eastAsia="Calibri" w:hAnsi="Calibri"/>
-          <w:color w:val="1A1A1A"/>
-          <w:sz w:val="21"/>
-          <w:szCs w:val="21"/>
-        </w:rPr>
-        <w:t xml:space="preserve"> The store of receipts and outcome records, kept in R2, to which new records are only ever added. An erasure hides a visitor's records at once, and a nightly rewrite then removes them; the day report is compiled from the ledger.</w:t>
-      </w:r>
-    </w:p>
-    <w:p>
-      <w:pPr>
-        <w:spacing w:after="120" w:line="276"/>
-      </w:pPr>
-      <w:r>
-        <w:rPr>
-          <w:rFonts w:ascii="Calibri" w:cs="Calibri" w:eastAsia="Calibri" w:hAnsi="Calibri"/>
-          <w:b/>
-          <w:bCs/>
-          <w:color w:val="1A1A1A"/>
-          <w:sz w:val="21"/>
-          <w:szCs w:val="21"/>
-        </w:rPr>
-        <w:t xml:space="preserve">Lift.</w:t>
-      </w:r>
-      <w:r>
-        <w:rPr>
-          <w:rFonts w:ascii="Calibri" w:cs="Calibri" w:eastAsia="Calibri" w:hAnsi="Calibri"/>
-          <w:color w:val="1A1A1A"/>
-          <w:sz w:val="21"/>
-          <w:szCs w:val="21"/>
-        </w:rPr>
-        <w:t xml:space="preserve"> How much better a piece does than its slot's usual rate in the same context, held between half and double. While the learning dial is at 0 it is computed and recorded, and changes nothing; never quote a lift figure as a result.</w:t>
+        <w:t xml:space="preserve">K.</w:t>
+      </w:r>
+      <w:r>
+        <w:rPr>
+          <w:rFonts w:ascii="Calibri" w:cs="Calibri" w:eastAsia="Calibri" w:hAnsi="Calibri"/>
+          <w:color w:val="1A1A1A"/>
+          <w:sz w:val="21"/>
+          <w:szCs w:val="21"/>
+        </w:rPr>
+        <w:t xml:space="preserve"> How much evidence makes an interest half-strength: at the default of 1.8, interest reaches 0.5 when the raw score reaches 1.8. With each view weighted 1, one view gives 0.357, two give 0.526 and three give 0.625, enough to join an audience.</w:t>
+      </w:r>
+    </w:p>
+    <w:p>
+      <w:pPr>
+        <w:spacing w:after="120" w:line="276"/>
+      </w:pPr>
+      <w:r>
+        <w:rPr>
+          <w:rFonts w:ascii="Calibri" w:cs="Calibri" w:eastAsia="Calibri" w:hAnsi="Calibri"/>
+          <w:b/>
+          <w:bCs/>
+          <w:color w:val="1A1A1A"/>
+          <w:sz w:val="21"/>
+          <w:szCs w:val="21"/>
+        </w:rPr>
+        <w:t xml:space="preserve">KV.</w:t>
+      </w:r>
+      <w:r>
+        <w:rPr>
+          <w:rFonts w:ascii="Calibri" w:cs="Calibri" w:eastAsia="Calibri" w:hAnsi="Calibri"/>
+          <w:color w:val="1A1A1A"/>
+          <w:sz w:val="21"/>
+          <w:szCs w:val="21"/>
+        </w:rPr>
+        <w:t xml:space="preserve"> Cloudflare's key-value store: fast reads, with writes that take a short while to reach every location. The engine keeps visitor records and published snapshots there.</w:t>
       </w:r>
     </w:p>
     <w:p>
@@ -2646,7 +2540,7 @@
           <w:sz w:val="25"/>
           <w:szCs w:val="25"/>
         </w:rPr>
-        <w:t xml:space="preserve">M</w:t>
+        <w:t xml:space="preserve">L</w:t>
       </w:r>
       <w:bookmarkEnd w:id="13"/>
     </w:p>
@@ -2663,116 +2557,141 @@
           <w:sz w:val="21"/>
           <w:szCs w:val="21"/>
         </w:rPr>
-        <w:t xml:space="preserve">Measurement basis.</w:t>
-      </w:r>
-      <w:r>
-        <w:rPr>
-          <w:rFonts w:ascii="Calibri" w:cs="Calibri" w:eastAsia="Calibri" w:hAnsi="Calibri"/>
-          <w:color w:val="1A1A1A"/>
-          <w:sz w:val="21"/>
-          <w:szCs w:val="21"/>
-        </w:rPr>
-        <w:t xml:space="preserve"> Whether a slot counts a decision when it is served, or only once the page confirms it drew the piece (rendered), so that only what the visitor could see is counted.</w:t>
-      </w:r>
-    </w:p>
-    <w:p>
-      <w:pPr>
-        <w:spacing w:after="120" w:line="276"/>
-      </w:pPr>
-      <w:r>
-        <w:rPr>
-          <w:rFonts w:ascii="Calibri" w:cs="Calibri" w:eastAsia="Calibri" w:hAnsi="Calibri"/>
-          <w:b/>
-          <w:bCs/>
-          <w:color w:val="1A1A1A"/>
-          <w:sz w:val="21"/>
-          <w:szCs w:val="21"/>
-        </w:rPr>
-        <w:t xml:space="preserve">Membership.</w:t>
-      </w:r>
-      <w:r>
-        <w:rPr>
-          <w:rFonts w:ascii="Calibri" w:cs="Calibri" w:eastAsia="Calibri" w:hAnsi="Calibri"/>
-          <w:color w:val="1A1A1A"/>
-          <w:sz w:val="21"/>
-          <w:szCs w:val="21"/>
-        </w:rPr>
-        <w:t xml:space="preserve"> Deprecated for readers: say audience. It is the engineers' word for being in one.</w:t>
-      </w:r>
-    </w:p>
-    <w:p>
-      <w:pPr>
-        <w:spacing w:after="120" w:line="276"/>
-      </w:pPr>
-      <w:r>
-        <w:rPr>
-          <w:rFonts w:ascii="Calibri" w:cs="Calibri" w:eastAsia="Calibri" w:hAnsi="Calibri"/>
-          <w:b/>
-          <w:bCs/>
-          <w:color w:val="1A1A1A"/>
-          <w:sz w:val="21"/>
-          <w:szCs w:val="21"/>
-        </w:rPr>
-        <w:t xml:space="preserve">Memory (τ).</w:t>
-      </w:r>
-      <w:r>
-        <w:rPr>
-          <w:rFonts w:ascii="Calibri" w:cs="Calibri" w:eastAsia="Calibri" w:hAnsi="Calibri"/>
-          <w:color w:val="1A1A1A"/>
-          <w:sz w:val="21"/>
-          <w:szCs w:val="21"/>
-        </w:rPr>
-        <w:t xml:space="preserve"> How long an interest lasts without new actions, set by the brand in its registry and, if it wants, per dimension. τ is a time constant, not a half-life: the evidence behind an interest falls to about 37 percent after τ and to half after about 0.69 τ. The engine's default is 14 days and the most a brand may set is 90, and a demo may publish a far shorter memory so that a change happens while a presenter talks.</w:t>
-      </w:r>
-    </w:p>
-    <w:p>
-      <w:pPr>
-        <w:spacing w:after="120" w:line="276"/>
-      </w:pPr>
-      <w:r>
-        <w:rPr>
-          <w:rFonts w:ascii="Calibri" w:cs="Calibri" w:eastAsia="Calibri" w:hAnsi="Calibri"/>
-          <w:b/>
-          <w:bCs/>
-          <w:color w:val="1A1A1A"/>
-          <w:sz w:val="21"/>
-          <w:szCs w:val="21"/>
-        </w:rPr>
-        <w:t xml:space="preserve">Merchandising weight.</w:t>
-      </w:r>
-      <w:r>
-        <w:rPr>
-          <w:rFonts w:ascii="Calibri" w:cs="Calibri" w:eastAsia="Calibri" w:hAnsi="Calibri"/>
-          <w:color w:val="1A1A1A"/>
-          <w:sz w:val="21"/>
-          <w:szCs w:val="21"/>
-        </w:rPr>
-        <w:t xml:space="preserve"> A multiplier the brand sets on a slot for season, promotion or margin, applied to pieces that carry those values and held within a range, half to double by default. It changes a score; it never overrides the brand's rules.</w:t>
-      </w:r>
-    </w:p>
-    <w:p>
-      <w:pPr>
-        <w:spacing w:after="120" w:line="276"/>
-      </w:pPr>
-      <w:r>
-        <w:rPr>
-          <w:rFonts w:ascii="Calibri" w:cs="Calibri" w:eastAsia="Calibri" w:hAnsi="Calibri"/>
-          <w:b/>
-          <w:bCs/>
-          <w:color w:val="1A1A1A"/>
-          <w:sz w:val="21"/>
-          <w:szCs w:val="21"/>
-        </w:rPr>
-        <w:t xml:space="preserve">Module.</w:t>
-      </w:r>
-      <w:r>
-        <w:rPr>
-          <w:rFonts w:ascii="Calibri" w:cs="Calibri" w:eastAsia="Calibri" w:hAnsi="Calibri"/>
-          <w:color w:val="1A1A1A"/>
-          <w:sz w:val="21"/>
-          <w:szCs w:val="21"/>
-        </w:rPr>
-        <w:t xml:space="preserve"> A block of a page's layout, such as a hero, a recommendations carousel, a category grid or reviews. The engine orders a page's modules for each visitor and context, not only what goes inside them, and holds pinned or locked modules where the brand put them.</w:t>
+        <w:t xml:space="preserve">Ladder.</w:t>
+      </w:r>
+      <w:r>
+        <w:rPr>
+          <w:rFonts w:ascii="Calibri" w:cs="Calibri" w:eastAsia="Calibri" w:hAnsi="Calibri"/>
+          <w:color w:val="1A1A1A"/>
+          <w:sz w:val="21"/>
+          <w:szCs w:val="21"/>
+        </w:rPr>
+        <w:t xml:space="preserve"> Deprecated: older material uses it for three different things. Say regional fallback for region, then country, then everyone; pooling levels for how learning widens its evidence; and never use it for a sequence of offerings.</w:t>
+      </w:r>
+    </w:p>
+    <w:p>
+      <w:pPr>
+        <w:spacing w:after="120" w:line="276"/>
+      </w:pPr>
+      <w:r>
+        <w:rPr>
+          <w:rFonts w:ascii="Calibri" w:cs="Calibri" w:eastAsia="Calibri" w:hAnsi="Calibri"/>
+          <w:b/>
+          <w:bCs/>
+          <w:color w:val="1A1A1A"/>
+          <w:sz w:val="21"/>
+          <w:szCs w:val="21"/>
+        </w:rPr>
+        <w:t xml:space="preserve">Learn document.</w:t>
+      </w:r>
+      <w:r>
+        <w:rPr>
+          <w:rFonts w:ascii="Calibri" w:cs="Calibri" w:eastAsia="Calibri" w:hAnsi="Calibri"/>
+          <w:color w:val="1A1A1A"/>
+          <w:sz w:val="21"/>
+          <w:szCs w:val="21"/>
+        </w:rPr>
+        <w:t xml:space="preserve"> The published document that holds the learning and measurement settings: the learning dial for each slot, the holdout, the regional prior, the attribution windows and exploration.</w:t>
+      </w:r>
+    </w:p>
+    <w:p>
+      <w:pPr>
+        <w:spacing w:after="120" w:line="276"/>
+      </w:pPr>
+      <w:r>
+        <w:rPr>
+          <w:rFonts w:ascii="Calibri" w:cs="Calibri" w:eastAsia="Calibri" w:hAnsi="Calibri"/>
+          <w:b/>
+          <w:bCs/>
+          <w:color w:val="1A1A1A"/>
+          <w:sz w:val="21"/>
+          <w:szCs w:val="21"/>
+        </w:rPr>
+        <w:t xml:space="preserve">Learning.</w:t>
+      </w:r>
+      <w:r>
+        <w:rPr>
+          <w:rFonts w:ascii="Calibri" w:cs="Calibri" w:eastAsia="Calibri" w:hAnsi="Calibri"/>
+          <w:color w:val="1A1A1A"/>
+          <w:sz w:val="21"/>
+          <w:szCs w:val="21"/>
+        </w:rPr>
+        <w:t xml:space="preserve"> Counting which pieces earn outcomes in which contexts, so that what works can move a piece's score; in this package the word never means building a visitor's interests. It is counting, never AI. It records what works from the first day and changes nothing until the brand turns the dial.</w:t>
+      </w:r>
+    </w:p>
+    <w:p>
+      <w:pPr>
+        <w:spacing w:after="120" w:line="276"/>
+      </w:pPr>
+      <w:r>
+        <w:rPr>
+          <w:rFonts w:ascii="Calibri" w:cs="Calibri" w:eastAsia="Calibri" w:hAnsi="Calibri"/>
+          <w:b/>
+          <w:bCs/>
+          <w:color w:val="1A1A1A"/>
+          <w:sz w:val="21"/>
+          <w:szCs w:val="21"/>
+        </w:rPr>
+        <w:t xml:space="preserve">Learning dial (γ).</w:t>
+      </w:r>
+      <w:r>
+        <w:rPr>
+          <w:rFonts w:ascii="Calibri" w:cs="Calibri" w:eastAsia="Calibri" w:hAnsi="Calibri"/>
+          <w:color w:val="1A1A1A"/>
+          <w:sz w:val="21"/>
+          <w:szCs w:val="21"/>
+        </w:rPr>
+        <w:t xml:space="preserve"> The setting on each slot, from 0 to 1, that decides how much learning may move its scores. It starts at 0, so what is learned moves nothing until a person raises it. Older material calls it the trust dial.</w:t>
+      </w:r>
+    </w:p>
+    <w:p>
+      <w:pPr>
+        <w:spacing w:after="120" w:line="276"/>
+      </w:pPr>
+      <w:r>
+        <w:rPr>
+          <w:rFonts w:ascii="Calibri" w:cs="Calibri" w:eastAsia="Calibri" w:hAnsi="Calibri"/>
+          <w:b/>
+          <w:bCs/>
+          <w:color w:val="1A1A1A"/>
+          <w:sz w:val="21"/>
+          <w:szCs w:val="21"/>
+        </w:rPr>
+        <w:t xml:space="preserve">Ledger.</w:t>
+      </w:r>
+      <w:r>
+        <w:rPr>
+          <w:rFonts w:ascii="Calibri" w:cs="Calibri" w:eastAsia="Calibri" w:hAnsi="Calibri"/>
+          <w:color w:val="1A1A1A"/>
+          <w:sz w:val="21"/>
+          <w:szCs w:val="21"/>
+        </w:rPr>
+        <w:t xml:space="preserve"> The store of receipts and outcome records, kept in R2, to which new records are only ever added. An erasure hides a visitor's records at once, and a nightly rewrite then removes them; the day report is compiled from the ledger.</w:t>
+      </w:r>
+    </w:p>
+    <w:p>
+      <w:pPr>
+        <w:spacing w:after="120" w:line="276"/>
+      </w:pPr>
+      <w:r>
+        <w:rPr>
+          <w:rFonts w:ascii="Calibri" w:cs="Calibri" w:eastAsia="Calibri" w:hAnsi="Calibri"/>
+          <w:b/>
+          <w:bCs/>
+          <w:color w:val="1A1A1A"/>
+          <w:sz w:val="21"/>
+          <w:szCs w:val="21"/>
+        </w:rPr>
+        <w:t xml:space="preserve">Lift.</w:t>
+      </w:r>
+      <w:r>
+        <w:rPr>
+          <w:rFonts w:ascii="Calibri" w:cs="Calibri" w:eastAsia="Calibri" w:hAnsi="Calibri"/>
+          <w:color w:val="1A1A1A"/>
+          <w:sz w:val="21"/>
+          <w:szCs w:val="21"/>
+        </w:rPr>
+        <w:t xml:space="preserve"> How much better a piece does than its slot's usual rate in the same context, held between half and double. While the learning dial is at 0 it is computed and recorded, and changes nothing; never quote a lift figure as a result.</w:t>
       </w:r>
     </w:p>
     <w:p>
@@ -2790,7 +2709,7 @@
           <w:sz w:val="25"/>
           <w:szCs w:val="25"/>
         </w:rPr>
-        <w:t xml:space="preserve">O</w:t>
+        <w:t xml:space="preserve">M</w:t>
       </w:r>
       <w:bookmarkEnd w:id="14"/>
     </w:p>
@@ -2807,116 +2726,116 @@
           <w:sz w:val="21"/>
           <w:szCs w:val="21"/>
         </w:rPr>
-        <w:t xml:space="preserve">ODP.</w:t>
-      </w:r>
-      <w:r>
-        <w:rPr>
-          <w:rFonts w:ascii="Calibri" w:cs="Calibri" w:eastAsia="Calibri" w:hAnsi="Calibri"/>
-          <w:color w:val="1A1A1A"/>
-          <w:sz w:val="21"/>
-          <w:szCs w:val="21"/>
-        </w:rPr>
-        <w:t xml:space="preserve"> Optimizely Data Platform, a separate Optimizely product the engine links with. Events, the audiences the engine forms and each visitor's journey stage land in it as lasting facts, and a recognized visitor's interests can be restored from it; decisions never wait on it.</w:t>
-      </w:r>
-    </w:p>
-    <w:p>
-      <w:pPr>
-        <w:spacing w:after="120" w:line="276"/>
-      </w:pPr>
-      <w:r>
-        <w:rPr>
-          <w:rFonts w:ascii="Calibri" w:cs="Calibri" w:eastAsia="Calibri" w:hAnsi="Calibri"/>
-          <w:b/>
-          <w:bCs/>
-          <w:color w:val="1A1A1A"/>
-          <w:sz w:val="21"/>
-          <w:szCs w:val="21"/>
-        </w:rPr>
-        <w:t xml:space="preserve">Off limits.</w:t>
-      </w:r>
-      <w:r>
-        <w:rPr>
-          <w:rFonts w:ascii="Calibri" w:cs="Calibri" w:eastAsia="Calibri" w:hAnsi="Calibri"/>
-          <w:color w:val="1A1A1A"/>
-          <w:sz w:val="21"/>
-          <w:szCs w:val="21"/>
-        </w:rPr>
-        <w:t xml:space="preserve"> A slot the brand marks so that the engine serves nothing there, such as a buy box. The site keeps its own content in that place; the engine never decides it.</w:t>
-      </w:r>
-    </w:p>
-    <w:p>
-      <w:pPr>
-        <w:spacing w:after="120" w:line="276"/>
-      </w:pPr>
-      <w:r>
-        <w:rPr>
-          <w:rFonts w:ascii="Calibri" w:cs="Calibri" w:eastAsia="Calibri" w:hAnsi="Calibri"/>
-          <w:b/>
-          <w:bCs/>
-          <w:color w:val="1A1A1A"/>
-          <w:sz w:val="21"/>
-          <w:szCs w:val="21"/>
-        </w:rPr>
-        <w:t xml:space="preserve">Opal.</w:t>
-      </w:r>
-      <w:r>
-        <w:rPr>
-          <w:rFonts w:ascii="Calibri" w:cs="Calibri" w:eastAsia="Calibri" w:hAnsi="Calibri"/>
-          <w:color w:val="1A1A1A"/>
-          <w:sz w:val="21"/>
-          <w:szCs w:val="21"/>
-        </w:rPr>
-        <w:t xml:space="preserve"> Optimizely's AI assistant, which works with the engine: it authors audiences and tests, explains results, tags content, and proposes and launches experiments on signals. It never takes part in a live decision; the engine produces its own reasons as arithmetic, and Opal is where people ask and generative AI creates.</w:t>
-      </w:r>
-    </w:p>
-    <w:p>
-      <w:pPr>
-        <w:spacing w:after="120" w:line="276"/>
-      </w:pPr>
-      <w:r>
-        <w:rPr>
-          <w:rFonts w:ascii="Calibri" w:cs="Calibri" w:eastAsia="Calibri" w:hAnsi="Calibri"/>
-          <w:b/>
-          <w:bCs/>
-          <w:color w:val="1A1A1A"/>
-          <w:sz w:val="21"/>
-          <w:szCs w:val="21"/>
-        </w:rPr>
-        <w:t xml:space="preserve">Operator.</w:t>
-      </w:r>
-      <w:r>
-        <w:rPr>
-          <w:rFonts w:ascii="Calibri" w:cs="Calibri" w:eastAsia="Calibri" w:hAnsi="Calibri"/>
-          <w:color w:val="1A1A1A"/>
-          <w:sz w:val="21"/>
-          <w:szCs w:val="21"/>
-        </w:rPr>
-        <w:t xml:space="preserve"> A person on the brand's team with an account and a grant for the brand, who signs in to the console to change settings. Sign-in can go through the brand's own single sign-on.</w:t>
-      </w:r>
-    </w:p>
-    <w:p>
-      <w:pPr>
-        <w:spacing w:after="120" w:line="276"/>
-      </w:pPr>
-      <w:r>
-        <w:rPr>
-          <w:rFonts w:ascii="Calibri" w:cs="Calibri" w:eastAsia="Calibri" w:hAnsi="Calibri"/>
-          <w:b/>
-          <w:bCs/>
-          <w:color w:val="1A1A1A"/>
-          <w:sz w:val="21"/>
-          <w:szCs w:val="21"/>
-        </w:rPr>
-        <w:t xml:space="preserve">Outcome.</w:t>
-      </w:r>
-      <w:r>
-        <w:rPr>
-          <w:rFonts w:ascii="Calibri" w:cs="Calibri" w:eastAsia="Calibri" w:hAnsi="Calibri"/>
-          <w:color w:val="1A1A1A"/>
-          <w:sz w:val="21"/>
-          <w:szCs w:val="21"/>
-        </w:rPr>
-        <w:t xml:space="preserve"> A visitor action that counts as success for learning: a click, a dwell, a completed video, a wishlist add, an add to cart, a purchase, or one of two named partner outcomes, a pickup at a partner store or a referral to a partner retailer. A named partner outcome is credited like a click and never reported as a sale.</w:t>
+        <w:t xml:space="preserve">Measurement basis.</w:t>
+      </w:r>
+      <w:r>
+        <w:rPr>
+          <w:rFonts w:ascii="Calibri" w:cs="Calibri" w:eastAsia="Calibri" w:hAnsi="Calibri"/>
+          <w:color w:val="1A1A1A"/>
+          <w:sz w:val="21"/>
+          <w:szCs w:val="21"/>
+        </w:rPr>
+        <w:t xml:space="preserve"> Whether a slot counts a decision when it is served, or only once the page confirms it drew the piece (rendered), so that only what the visitor could see is counted.</w:t>
+      </w:r>
+    </w:p>
+    <w:p>
+      <w:pPr>
+        <w:spacing w:after="120" w:line="276"/>
+      </w:pPr>
+      <w:r>
+        <w:rPr>
+          <w:rFonts w:ascii="Calibri" w:cs="Calibri" w:eastAsia="Calibri" w:hAnsi="Calibri"/>
+          <w:b/>
+          <w:bCs/>
+          <w:color w:val="1A1A1A"/>
+          <w:sz w:val="21"/>
+          <w:szCs w:val="21"/>
+        </w:rPr>
+        <w:t xml:space="preserve">Membership.</w:t>
+      </w:r>
+      <w:r>
+        <w:rPr>
+          <w:rFonts w:ascii="Calibri" w:cs="Calibri" w:eastAsia="Calibri" w:hAnsi="Calibri"/>
+          <w:color w:val="1A1A1A"/>
+          <w:sz w:val="21"/>
+          <w:szCs w:val="21"/>
+        </w:rPr>
+        <w:t xml:space="preserve"> Deprecated for readers: say audience. It is the engineers' word for being in one.</w:t>
+      </w:r>
+    </w:p>
+    <w:p>
+      <w:pPr>
+        <w:spacing w:after="120" w:line="276"/>
+      </w:pPr>
+      <w:r>
+        <w:rPr>
+          <w:rFonts w:ascii="Calibri" w:cs="Calibri" w:eastAsia="Calibri" w:hAnsi="Calibri"/>
+          <w:b/>
+          <w:bCs/>
+          <w:color w:val="1A1A1A"/>
+          <w:sz w:val="21"/>
+          <w:szCs w:val="21"/>
+        </w:rPr>
+        <w:t xml:space="preserve">Memory (τ).</w:t>
+      </w:r>
+      <w:r>
+        <w:rPr>
+          <w:rFonts w:ascii="Calibri" w:cs="Calibri" w:eastAsia="Calibri" w:hAnsi="Calibri"/>
+          <w:color w:val="1A1A1A"/>
+          <w:sz w:val="21"/>
+          <w:szCs w:val="21"/>
+        </w:rPr>
+        <w:t xml:space="preserve"> How long an interest lasts without new actions, set by the brand in its registry and, if it wants, per dimension. τ is a time constant, not a half-life: the evidence behind an interest falls to about 37 percent after τ and to half after about 0.69 τ. The engine's default is 14 days and the most a brand may set is 90, and a demo may publish a far shorter memory so that a change happens while a presenter talks.</w:t>
+      </w:r>
+    </w:p>
+    <w:p>
+      <w:pPr>
+        <w:spacing w:after="120" w:line="276"/>
+      </w:pPr>
+      <w:r>
+        <w:rPr>
+          <w:rFonts w:ascii="Calibri" w:cs="Calibri" w:eastAsia="Calibri" w:hAnsi="Calibri"/>
+          <w:b/>
+          <w:bCs/>
+          <w:color w:val="1A1A1A"/>
+          <w:sz w:val="21"/>
+          <w:szCs w:val="21"/>
+        </w:rPr>
+        <w:t xml:space="preserve">Merchandising weight.</w:t>
+      </w:r>
+      <w:r>
+        <w:rPr>
+          <w:rFonts w:ascii="Calibri" w:cs="Calibri" w:eastAsia="Calibri" w:hAnsi="Calibri"/>
+          <w:color w:val="1A1A1A"/>
+          <w:sz w:val="21"/>
+          <w:szCs w:val="21"/>
+        </w:rPr>
+        <w:t xml:space="preserve"> A multiplier the brand sets on a slot for season, promotion or margin, applied to pieces that carry those values and held within a range, half to double by default. It changes a score; it never overrides the brand's rules.</w:t>
+      </w:r>
+    </w:p>
+    <w:p>
+      <w:pPr>
+        <w:spacing w:after="120" w:line="276"/>
+      </w:pPr>
+      <w:r>
+        <w:rPr>
+          <w:rFonts w:ascii="Calibri" w:cs="Calibri" w:eastAsia="Calibri" w:hAnsi="Calibri"/>
+          <w:b/>
+          <w:bCs/>
+          <w:color w:val="1A1A1A"/>
+          <w:sz w:val="21"/>
+          <w:szCs w:val="21"/>
+        </w:rPr>
+        <w:t xml:space="preserve">Module.</w:t>
+      </w:r>
+      <w:r>
+        <w:rPr>
+          <w:rFonts w:ascii="Calibri" w:cs="Calibri" w:eastAsia="Calibri" w:hAnsi="Calibri"/>
+          <w:color w:val="1A1A1A"/>
+          <w:sz w:val="21"/>
+          <w:szCs w:val="21"/>
+        </w:rPr>
+        <w:t xml:space="preserve"> A block of a page's layout, such as a hero, a recommendations carousel, a category grid or reviews. The engine orders a page's modules for each visitor and context, not only what goes inside them, and holds pinned or locked modules where the brand put them.</w:t>
       </w:r>
     </w:p>
     <w:p>
@@ -2934,7 +2853,7 @@
           <w:sz w:val="25"/>
           <w:szCs w:val="25"/>
         </w:rPr>
-        <w:t xml:space="preserve">P</w:t>
+        <w:t xml:space="preserve">O</w:t>
       </w:r>
       <w:bookmarkEnd w:id="15"/>
     </w:p>
@@ -2951,216 +2870,116 @@
           <w:sz w:val="21"/>
           <w:szCs w:val="21"/>
         </w:rPr>
-        <w:t xml:space="preserve">Phase.</w:t>
-      </w:r>
-      <w:r>
-        <w:rPr>
-          <w:rFonts w:ascii="Calibri" w:cs="Calibri" w:eastAsia="Calibri" w:hAnsi="Calibri"/>
-          <w:color w:val="1A1A1A"/>
-          <w:sz w:val="21"/>
-          <w:szCs w:val="21"/>
-        </w:rPr>
-        <w:t xml:space="preserve"> Deprecated: older material uses it for delivery phases and for parts of a session. Say before, during and after for the session, and step for the implementation path.</w:t>
-      </w:r>
-    </w:p>
-    <w:p>
-      <w:pPr>
-        <w:spacing w:after="120" w:line="276"/>
-      </w:pPr>
-      <w:r>
-        <w:rPr>
-          <w:rFonts w:ascii="Calibri" w:cs="Calibri" w:eastAsia="Calibri" w:hAnsi="Calibri"/>
-          <w:b/>
-          <w:bCs/>
-          <w:color w:val="1A1A1A"/>
-          <w:sz w:val="21"/>
-          <w:szCs w:val="21"/>
-        </w:rPr>
-        <w:t xml:space="preserve">Piece.</w:t>
-      </w:r>
-      <w:r>
-        <w:rPr>
-          <w:rFonts w:ascii="Calibri" w:cs="Calibri" w:eastAsia="Calibri" w:hAnsi="Calibri"/>
-          <w:color w:val="1A1A1A"/>
-          <w:sz w:val="21"/>
-          <w:szCs w:val="21"/>
-        </w:rPr>
-        <w:t xml:space="preserve"> One item of the brand's content in the catalog, such as a promotion, a banner or an article, named by the brand's own content id. The engine answers with these ids, and the site renders the pieces.</w:t>
-      </w:r>
-    </w:p>
-    <w:p>
-      <w:pPr>
-        <w:spacing w:after="120" w:line="276"/>
-      </w:pPr>
-      <w:r>
-        <w:rPr>
-          <w:rFonts w:ascii="Calibri" w:cs="Calibri" w:eastAsia="Calibri" w:hAnsi="Calibri"/>
-          <w:b/>
-          <w:bCs/>
-          <w:color w:val="1A1A1A"/>
-          <w:sz w:val="21"/>
-          <w:szCs w:val="21"/>
-        </w:rPr>
-        <w:t xml:space="preserve">Pin.</w:t>
-      </w:r>
-      <w:r>
-        <w:rPr>
-          <w:rFonts w:ascii="Calibri" w:cs="Calibri" w:eastAsia="Calibri" w:hAnsi="Calibri"/>
-          <w:color w:val="1A1A1A"/>
-          <w:sz w:val="21"/>
-          <w:szCs w:val="21"/>
-        </w:rPr>
-        <w:t xml:space="preserve"> The brand's instruction that named pieces fill a slot's first positions before any ranking, such as the placements the brand sells; the rest of the slot is still ranked. The receipt says ranking never ran for the pinned pieces.</w:t>
-      </w:r>
-    </w:p>
-    <w:p>
-      <w:pPr>
-        <w:spacing w:after="120" w:line="276"/>
-      </w:pPr>
-      <w:r>
-        <w:rPr>
-          <w:rFonts w:ascii="Calibri" w:cs="Calibri" w:eastAsia="Calibri" w:hAnsi="Calibri"/>
-          <w:b/>
-          <w:bCs/>
-          <w:color w:val="1A1A1A"/>
-          <w:sz w:val="21"/>
-          <w:szCs w:val="21"/>
-        </w:rPr>
-        <w:t xml:space="preserve">Placement.</w:t>
-      </w:r>
-      <w:r>
-        <w:rPr>
-          <w:rFonts w:ascii="Calibri" w:cs="Calibri" w:eastAsia="Calibri" w:hAnsi="Calibri"/>
-          <w:color w:val="1A1A1A"/>
-          <w:sz w:val="21"/>
-          <w:szCs w:val="21"/>
-        </w:rPr>
-        <w:t xml:space="preserve"> A section of a page that a merchandiser sells or reserves, such as a spot a partner pays for or a funded campaign. The engine honors it through a pin, so it holds its place while the rest of the page is ranked, and the receipt says so.</w:t>
-      </w:r>
-    </w:p>
-    <w:p>
-      <w:pPr>
-        <w:spacing w:after="120" w:line="276"/>
-      </w:pPr>
-      <w:r>
-        <w:rPr>
-          <w:rFonts w:ascii="Calibri" w:cs="Calibri" w:eastAsia="Calibri" w:hAnsi="Calibri"/>
-          <w:b/>
-          <w:bCs/>
-          <w:color w:val="1A1A1A"/>
-          <w:sz w:val="21"/>
-          <w:szCs w:val="21"/>
-        </w:rPr>
-        <w:t xml:space="preserve">Pooling levels.</w:t>
-      </w:r>
-      <w:r>
-        <w:rPr>
-          <w:rFonts w:ascii="Calibri" w:cs="Calibri" w:eastAsia="Calibri" w:hAnsi="Calibri"/>
-          <w:color w:val="1A1A1A"/>
-          <w:sz w:val="21"/>
-          <w:szCs w:val="21"/>
-        </w:rPr>
-        <w:t xml:space="preserve"> How learning widens its evidence when a context has too little: from the full context through coarser ones to everyone, using the finest level with enough exposures. Older material calls this the pooling ladder.</w:t>
-      </w:r>
-    </w:p>
-    <w:p>
-      <w:pPr>
-        <w:spacing w:after="120" w:line="276"/>
-      </w:pPr>
-      <w:r>
-        <w:rPr>
-          <w:rFonts w:ascii="Calibri" w:cs="Calibri" w:eastAsia="Calibri" w:hAnsi="Calibri"/>
-          <w:b/>
-          <w:bCs/>
-          <w:color w:val="1A1A1A"/>
-          <w:sz w:val="21"/>
-          <w:szCs w:val="21"/>
-        </w:rPr>
-        <w:t xml:space="preserve">Prior.</w:t>
-      </w:r>
-      <w:r>
-        <w:rPr>
-          <w:rFonts w:ascii="Calibri" w:cs="Calibri" w:eastAsia="Calibri" w:hAnsi="Calibri"/>
-          <w:color w:val="1A1A1A"/>
-          <w:sz w:val="21"/>
-          <w:szCs w:val="21"/>
-        </w:rPr>
-        <w:t xml:space="preserve"> What the engine assumes before it has evidence. This package meets three kinds: the regional prior for a stranger's interests, a slot's usual rate that a new piece's learning starts from, and imported priors, a warehouse's starting beliefs per piece and context.</w:t>
-      </w:r>
-    </w:p>
-    <w:p>
-      <w:pPr>
-        <w:spacing w:after="120" w:line="276"/>
-      </w:pPr>
-      <w:r>
-        <w:rPr>
-          <w:rFonts w:ascii="Calibri" w:cs="Calibri" w:eastAsia="Calibri" w:hAnsi="Calibri"/>
-          <w:b/>
-          <w:bCs/>
-          <w:color w:val="1A1A1A"/>
-          <w:sz w:val="21"/>
-          <w:szCs w:val="21"/>
-        </w:rPr>
-        <w:t xml:space="preserve">Product re-ranking.</w:t>
-      </w:r>
-      <w:r>
-        <w:rPr>
-          <w:rFonts w:ascii="Calibri" w:cs="Calibri" w:eastAsia="Calibri" w:hAnsi="Calibri"/>
-          <w:color w:val="1A1A1A"/>
-          <w:sz w:val="21"/>
-          <w:szCs w:val="21"/>
-        </w:rPr>
-        <w:t xml:space="preserve"> Reordering a product list that the commerce platform supplies, by the visitor's interests, without removing anything. With its dial at 0 the platform's own order comes back unchanged.</w:t>
-      </w:r>
-    </w:p>
-    <w:p>
-      <w:pPr>
-        <w:spacing w:after="120" w:line="276"/>
-      </w:pPr>
-      <w:r>
-        <w:rPr>
-          <w:rFonts w:ascii="Calibri" w:cs="Calibri" w:eastAsia="Calibri" w:hAnsi="Calibri"/>
-          <w:b/>
-          <w:bCs/>
-          <w:color w:val="1A1A1A"/>
-          <w:sz w:val="21"/>
-          <w:szCs w:val="21"/>
-        </w:rPr>
-        <w:t xml:space="preserve">Publication set.</w:t>
-      </w:r>
-      <w:r>
-        <w:rPr>
-          <w:rFonts w:ascii="Calibri" w:cs="Calibri" w:eastAsia="Calibri" w:hAnsi="Calibri"/>
-          <w:color w:val="1A1A1A"/>
-          <w:sz w:val="21"/>
-          <w:szCs w:val="21"/>
-        </w:rPr>
-        <w:t xml:space="preserve"> Deprecated for readers: say published documents.</w:t>
-      </w:r>
-    </w:p>
-    <w:p>
-      <w:pPr>
-        <w:spacing w:after="120" w:line="276"/>
-      </w:pPr>
-      <w:r>
-        <w:rPr>
-          <w:rFonts w:ascii="Calibri" w:cs="Calibri" w:eastAsia="Calibri" w:hAnsi="Calibri"/>
-          <w:b/>
-          <w:bCs/>
-          <w:color w:val="1A1A1A"/>
-          <w:sz w:val="21"/>
-          <w:szCs w:val="21"/>
-        </w:rPr>
-        <w:t xml:space="preserve">Published documents.</w:t>
-      </w:r>
-      <w:r>
-        <w:rPr>
-          <w:rFonts w:ascii="Calibri" w:cs="Calibri" w:eastAsia="Calibri" w:hAnsi="Calibri"/>
-          <w:color w:val="1A1A1A"/>
-          <w:sz w:val="21"/>
-          <w:szCs w:val="21"/>
-        </w:rPr>
-        <w:t xml:space="preserve"> The brand's versioned settings: the registry, the catalog, the slots document and the learn document, plus imported priors and retained proposals. Every save is a new revision recording who changed it and why, and it is in force without a software release.</w:t>
+        <w:t xml:space="preserve">ODP.</w:t>
+      </w:r>
+      <w:r>
+        <w:rPr>
+          <w:rFonts w:ascii="Calibri" w:cs="Calibri" w:eastAsia="Calibri" w:hAnsi="Calibri"/>
+          <w:color w:val="1A1A1A"/>
+          <w:sz w:val="21"/>
+          <w:szCs w:val="21"/>
+        </w:rPr>
+        <w:t xml:space="preserve"> Optimizely Data Platform, a separate Optimizely product the engine links with. Events, the audiences the engine forms and each visitor's journey stage land in it as lasting facts, and a recognized visitor's interests can be restored from it; decisions never wait on it.</w:t>
+      </w:r>
+    </w:p>
+    <w:p>
+      <w:pPr>
+        <w:spacing w:after="120" w:line="276"/>
+      </w:pPr>
+      <w:r>
+        <w:rPr>
+          <w:rFonts w:ascii="Calibri" w:cs="Calibri" w:eastAsia="Calibri" w:hAnsi="Calibri"/>
+          <w:b/>
+          <w:bCs/>
+          <w:color w:val="1A1A1A"/>
+          <w:sz w:val="21"/>
+          <w:szCs w:val="21"/>
+        </w:rPr>
+        <w:t xml:space="preserve">Off limits.</w:t>
+      </w:r>
+      <w:r>
+        <w:rPr>
+          <w:rFonts w:ascii="Calibri" w:cs="Calibri" w:eastAsia="Calibri" w:hAnsi="Calibri"/>
+          <w:color w:val="1A1A1A"/>
+          <w:sz w:val="21"/>
+          <w:szCs w:val="21"/>
+        </w:rPr>
+        <w:t xml:space="preserve"> A slot the brand marks so that the engine serves nothing there, such as a buy box. The site keeps its own content in that place; the engine never decides it.</w:t>
+      </w:r>
+    </w:p>
+    <w:p>
+      <w:pPr>
+        <w:spacing w:after="120" w:line="276"/>
+      </w:pPr>
+      <w:r>
+        <w:rPr>
+          <w:rFonts w:ascii="Calibri" w:cs="Calibri" w:eastAsia="Calibri" w:hAnsi="Calibri"/>
+          <w:b/>
+          <w:bCs/>
+          <w:color w:val="1A1A1A"/>
+          <w:sz w:val="21"/>
+          <w:szCs w:val="21"/>
+        </w:rPr>
+        <w:t xml:space="preserve">Opal.</w:t>
+      </w:r>
+      <w:r>
+        <w:rPr>
+          <w:rFonts w:ascii="Calibri" w:cs="Calibri" w:eastAsia="Calibri" w:hAnsi="Calibri"/>
+          <w:color w:val="1A1A1A"/>
+          <w:sz w:val="21"/>
+          <w:szCs w:val="21"/>
+        </w:rPr>
+        <w:t xml:space="preserve"> Optimizely's AI assistant, which works with the engine: it authors audiences and tests, explains results, tags content, and proposes and launches experiments on signals. It never takes part in a live decision; the engine produces its own reasons as arithmetic, and Opal is where people ask and generative AI creates.</w:t>
+      </w:r>
+    </w:p>
+    <w:p>
+      <w:pPr>
+        <w:spacing w:after="120" w:line="276"/>
+      </w:pPr>
+      <w:r>
+        <w:rPr>
+          <w:rFonts w:ascii="Calibri" w:cs="Calibri" w:eastAsia="Calibri" w:hAnsi="Calibri"/>
+          <w:b/>
+          <w:bCs/>
+          <w:color w:val="1A1A1A"/>
+          <w:sz w:val="21"/>
+          <w:szCs w:val="21"/>
+        </w:rPr>
+        <w:t xml:space="preserve">Operator.</w:t>
+      </w:r>
+      <w:r>
+        <w:rPr>
+          <w:rFonts w:ascii="Calibri" w:cs="Calibri" w:eastAsia="Calibri" w:hAnsi="Calibri"/>
+          <w:color w:val="1A1A1A"/>
+          <w:sz w:val="21"/>
+          <w:szCs w:val="21"/>
+        </w:rPr>
+        <w:t xml:space="preserve"> A person on the brand's team with an account and a grant for the brand, who signs in to the console to change settings. Sign-in can go through the brand's own single sign-on.</w:t>
+      </w:r>
+    </w:p>
+    <w:p>
+      <w:pPr>
+        <w:spacing w:after="120" w:line="276"/>
+      </w:pPr>
+      <w:r>
+        <w:rPr>
+          <w:rFonts w:ascii="Calibri" w:cs="Calibri" w:eastAsia="Calibri" w:hAnsi="Calibri"/>
+          <w:b/>
+          <w:bCs/>
+          <w:color w:val="1A1A1A"/>
+          <w:sz w:val="21"/>
+          <w:szCs w:val="21"/>
+        </w:rPr>
+        <w:t xml:space="preserve">Outcome.</w:t>
+      </w:r>
+      <w:r>
+        <w:rPr>
+          <w:rFonts w:ascii="Calibri" w:cs="Calibri" w:eastAsia="Calibri" w:hAnsi="Calibri"/>
+          <w:color w:val="1A1A1A"/>
+          <w:sz w:val="21"/>
+          <w:szCs w:val="21"/>
+        </w:rPr>
+        <w:t xml:space="preserve"> A visitor action that counts as success for learning: a click, a dwell, a completed video, a wishlist add, an add to cart, a purchase, or one of two named partner outcomes, a pickup at a partner store or a referral to a partner retailer. A named partner outcome is credited like a click and never reported as a sale.</w:t>
       </w:r>
     </w:p>
     <w:p>
@@ -3178,7 +2997,7 @@
           <w:sz w:val="25"/>
           <w:szCs w:val="25"/>
         </w:rPr>
-        <w:t xml:space="preserve">Q</w:t>
+        <w:t xml:space="preserve">P</w:t>
       </w:r>
       <w:bookmarkEnd w:id="16"/>
     </w:p>
@@ -3195,16 +3014,216 @@
           <w:sz w:val="21"/>
           <w:szCs w:val="21"/>
         </w:rPr>
-        <w:t xml:space="preserve">Queue.</w:t>
-      </w:r>
-      <w:r>
-        <w:rPr>
-          <w:rFonts w:ascii="Calibri" w:cs="Calibri" w:eastAsia="Calibri" w:hAnsi="Calibri"/>
-          <w:color w:val="1A1A1A"/>
-          <w:sz w:val="21"/>
-          <w:szCs w:val="21"/>
-        </w:rPr>
-        <w:t xml:space="preserve"> A message queue: work handed off during a request and done moments later, such as writing receipts to the ledger.</w:t>
+        <w:t xml:space="preserve">Phase.</w:t>
+      </w:r>
+      <w:r>
+        <w:rPr>
+          <w:rFonts w:ascii="Calibri" w:cs="Calibri" w:eastAsia="Calibri" w:hAnsi="Calibri"/>
+          <w:color w:val="1A1A1A"/>
+          <w:sz w:val="21"/>
+          <w:szCs w:val="21"/>
+        </w:rPr>
+        <w:t xml:space="preserve"> Deprecated: older material uses it for delivery phases and for parts of a session. Say before, during and after for the session, and step for the implementation path.</w:t>
+      </w:r>
+    </w:p>
+    <w:p>
+      <w:pPr>
+        <w:spacing w:after="120" w:line="276"/>
+      </w:pPr>
+      <w:r>
+        <w:rPr>
+          <w:rFonts w:ascii="Calibri" w:cs="Calibri" w:eastAsia="Calibri" w:hAnsi="Calibri"/>
+          <w:b/>
+          <w:bCs/>
+          <w:color w:val="1A1A1A"/>
+          <w:sz w:val="21"/>
+          <w:szCs w:val="21"/>
+        </w:rPr>
+        <w:t xml:space="preserve">Piece.</w:t>
+      </w:r>
+      <w:r>
+        <w:rPr>
+          <w:rFonts w:ascii="Calibri" w:cs="Calibri" w:eastAsia="Calibri" w:hAnsi="Calibri"/>
+          <w:color w:val="1A1A1A"/>
+          <w:sz w:val="21"/>
+          <w:szCs w:val="21"/>
+        </w:rPr>
+        <w:t xml:space="preserve"> One item of the brand's content in the catalog, such as a promotion, a banner or an article, named by the brand's own content id. The engine answers with these ids, and the site renders the pieces.</w:t>
+      </w:r>
+    </w:p>
+    <w:p>
+      <w:pPr>
+        <w:spacing w:after="120" w:line="276"/>
+      </w:pPr>
+      <w:r>
+        <w:rPr>
+          <w:rFonts w:ascii="Calibri" w:cs="Calibri" w:eastAsia="Calibri" w:hAnsi="Calibri"/>
+          <w:b/>
+          <w:bCs/>
+          <w:color w:val="1A1A1A"/>
+          <w:sz w:val="21"/>
+          <w:szCs w:val="21"/>
+        </w:rPr>
+        <w:t xml:space="preserve">Pin.</w:t>
+      </w:r>
+      <w:r>
+        <w:rPr>
+          <w:rFonts w:ascii="Calibri" w:cs="Calibri" w:eastAsia="Calibri" w:hAnsi="Calibri"/>
+          <w:color w:val="1A1A1A"/>
+          <w:sz w:val="21"/>
+          <w:szCs w:val="21"/>
+        </w:rPr>
+        <w:t xml:space="preserve"> The brand's instruction that a named piece holds the place the brand sets in a slot, first or any other, before any ranking, such as a placement the brand sells; the rest of the slot is still ranked around it. A pinned piece that may not show, such as one out of stock, is simply not shown, and the rest of the slot ranks as usual. The receipt says ranking never ran for the pinned piece.</w:t>
+      </w:r>
+    </w:p>
+    <w:p>
+      <w:pPr>
+        <w:spacing w:after="120" w:line="276"/>
+      </w:pPr>
+      <w:r>
+        <w:rPr>
+          <w:rFonts w:ascii="Calibri" w:cs="Calibri" w:eastAsia="Calibri" w:hAnsi="Calibri"/>
+          <w:b/>
+          <w:bCs/>
+          <w:color w:val="1A1A1A"/>
+          <w:sz w:val="21"/>
+          <w:szCs w:val="21"/>
+        </w:rPr>
+        <w:t xml:space="preserve">Placement.</w:t>
+      </w:r>
+      <w:r>
+        <w:rPr>
+          <w:rFonts w:ascii="Calibri" w:cs="Calibri" w:eastAsia="Calibri" w:hAnsi="Calibri"/>
+          <w:color w:val="1A1A1A"/>
+          <w:sz w:val="21"/>
+          <w:szCs w:val="21"/>
+        </w:rPr>
+        <w:t xml:space="preserve"> A section of a page that a merchandiser sells or reserves, such as a spot a partner pays for or a funded campaign. The engine honors it through a pin, so it holds the place the brand set while the rest is ranked around it, and the receipt says so.</w:t>
+      </w:r>
+    </w:p>
+    <w:p>
+      <w:pPr>
+        <w:spacing w:after="120" w:line="276"/>
+      </w:pPr>
+      <w:r>
+        <w:rPr>
+          <w:rFonts w:ascii="Calibri" w:cs="Calibri" w:eastAsia="Calibri" w:hAnsi="Calibri"/>
+          <w:b/>
+          <w:bCs/>
+          <w:color w:val="1A1A1A"/>
+          <w:sz w:val="21"/>
+          <w:szCs w:val="21"/>
+        </w:rPr>
+        <w:t xml:space="preserve">Pooling levels.</w:t>
+      </w:r>
+      <w:r>
+        <w:rPr>
+          <w:rFonts w:ascii="Calibri" w:cs="Calibri" w:eastAsia="Calibri" w:hAnsi="Calibri"/>
+          <w:color w:val="1A1A1A"/>
+          <w:sz w:val="21"/>
+          <w:szCs w:val="21"/>
+        </w:rPr>
+        <w:t xml:space="preserve"> How learning widens its evidence when a context has too little: from the full context through coarser ones to everyone, using the finest level with enough exposures. Older material calls this the pooling ladder.</w:t>
+      </w:r>
+    </w:p>
+    <w:p>
+      <w:pPr>
+        <w:spacing w:after="120" w:line="276"/>
+      </w:pPr>
+      <w:r>
+        <w:rPr>
+          <w:rFonts w:ascii="Calibri" w:cs="Calibri" w:eastAsia="Calibri" w:hAnsi="Calibri"/>
+          <w:b/>
+          <w:bCs/>
+          <w:color w:val="1A1A1A"/>
+          <w:sz w:val="21"/>
+          <w:szCs w:val="21"/>
+        </w:rPr>
+        <w:t xml:space="preserve">Prior.</w:t>
+      </w:r>
+      <w:r>
+        <w:rPr>
+          <w:rFonts w:ascii="Calibri" w:cs="Calibri" w:eastAsia="Calibri" w:hAnsi="Calibri"/>
+          <w:color w:val="1A1A1A"/>
+          <w:sz w:val="21"/>
+          <w:szCs w:val="21"/>
+        </w:rPr>
+        <w:t xml:space="preserve"> What the engine assumes before it has evidence. This package meets three kinds: the regional prior for a stranger's interests, a slot's usual rate that a new piece's learning starts from, and imported priors, a warehouse's starting beliefs per piece and context.</w:t>
+      </w:r>
+    </w:p>
+    <w:p>
+      <w:pPr>
+        <w:spacing w:after="120" w:line="276"/>
+      </w:pPr>
+      <w:r>
+        <w:rPr>
+          <w:rFonts w:ascii="Calibri" w:cs="Calibri" w:eastAsia="Calibri" w:hAnsi="Calibri"/>
+          <w:b/>
+          <w:bCs/>
+          <w:color w:val="1A1A1A"/>
+          <w:sz w:val="21"/>
+          <w:szCs w:val="21"/>
+        </w:rPr>
+        <w:t xml:space="preserve">Product re-ranking.</w:t>
+      </w:r>
+      <w:r>
+        <w:rPr>
+          <w:rFonts w:ascii="Calibri" w:cs="Calibri" w:eastAsia="Calibri" w:hAnsi="Calibri"/>
+          <w:color w:val="1A1A1A"/>
+          <w:sz w:val="21"/>
+          <w:szCs w:val="21"/>
+        </w:rPr>
+        <w:t xml:space="preserve"> Reordering a product list that the commerce platform supplies, by the visitor's interests, without removing anything. With its dial at 0 the platform's own order comes back unchanged.</w:t>
+      </w:r>
+    </w:p>
+    <w:p>
+      <w:pPr>
+        <w:spacing w:after="120" w:line="276"/>
+      </w:pPr>
+      <w:r>
+        <w:rPr>
+          <w:rFonts w:ascii="Calibri" w:cs="Calibri" w:eastAsia="Calibri" w:hAnsi="Calibri"/>
+          <w:b/>
+          <w:bCs/>
+          <w:color w:val="1A1A1A"/>
+          <w:sz w:val="21"/>
+          <w:szCs w:val="21"/>
+        </w:rPr>
+        <w:t xml:space="preserve">Publication set.</w:t>
+      </w:r>
+      <w:r>
+        <w:rPr>
+          <w:rFonts w:ascii="Calibri" w:cs="Calibri" w:eastAsia="Calibri" w:hAnsi="Calibri"/>
+          <w:color w:val="1A1A1A"/>
+          <w:sz w:val="21"/>
+          <w:szCs w:val="21"/>
+        </w:rPr>
+        <w:t xml:space="preserve"> Deprecated for readers: say published documents.</w:t>
+      </w:r>
+    </w:p>
+    <w:p>
+      <w:pPr>
+        <w:spacing w:after="120" w:line="276"/>
+      </w:pPr>
+      <w:r>
+        <w:rPr>
+          <w:rFonts w:ascii="Calibri" w:cs="Calibri" w:eastAsia="Calibri" w:hAnsi="Calibri"/>
+          <w:b/>
+          <w:bCs/>
+          <w:color w:val="1A1A1A"/>
+          <w:sz w:val="21"/>
+          <w:szCs w:val="21"/>
+        </w:rPr>
+        <w:t xml:space="preserve">Published documents.</w:t>
+      </w:r>
+      <w:r>
+        <w:rPr>
+          <w:rFonts w:ascii="Calibri" w:cs="Calibri" w:eastAsia="Calibri" w:hAnsi="Calibri"/>
+          <w:color w:val="1A1A1A"/>
+          <w:sz w:val="21"/>
+          <w:szCs w:val="21"/>
+        </w:rPr>
+        <w:t xml:space="preserve"> The brand's versioned settings: the registry, the catalog, the slots document and the learn document, plus imported priors and retained proposals. Every save is a new revision recording who changed it and why, and it is in force without a software release.</w:t>
       </w:r>
     </w:p>
     <w:p>
@@ -3222,7 +3241,7 @@
           <w:sz w:val="25"/>
           <w:szCs w:val="25"/>
         </w:rPr>
-        <w:t xml:space="preserve">R</w:t>
+        <w:t xml:space="preserve">Q</w:t>
       </w:r>
       <w:bookmarkEnd w:id="17"/>
     </w:p>
@@ -3239,291 +3258,16 @@
           <w:sz w:val="21"/>
           <w:szCs w:val="21"/>
         </w:rPr>
-        <w:t xml:space="preserve">R2.</w:t>
-      </w:r>
-      <w:r>
-        <w:rPr>
-          <w:rFonts w:ascii="Calibri" w:cs="Calibri" w:eastAsia="Calibri" w:hAnsi="Calibri"/>
-          <w:color w:val="1A1A1A"/>
-          <w:sz w:val="21"/>
-          <w:szCs w:val="21"/>
-        </w:rPr>
-        <w:t xml:space="preserve"> Cloudflare's file storage. The engine keeps the published documents, the ledger and the day reports there.</w:t>
-      </w:r>
-    </w:p>
-    <w:p>
-      <w:pPr>
-        <w:spacing w:after="120" w:line="276"/>
-      </w:pPr>
-      <w:r>
-        <w:rPr>
-          <w:rFonts w:ascii="Calibri" w:cs="Calibri" w:eastAsia="Calibri" w:hAnsi="Calibri"/>
-          <w:b/>
-          <w:bCs/>
-          <w:color w:val="1A1A1A"/>
-          <w:sz w:val="21"/>
-          <w:szCs w:val="21"/>
-        </w:rPr>
-        <w:t xml:space="preserve">Raw score (R).</w:t>
-      </w:r>
-      <w:r>
-        <w:rPr>
-          <w:rFonts w:ascii="Calibri" w:cs="Calibri" w:eastAsia="Calibri" w:hAnsi="Calibri"/>
-          <w:color w:val="1A1A1A"/>
-          <w:sz w:val="21"/>
-          <w:szCs w:val="21"/>
-        </w:rPr>
-        <w:t xml:space="preserve"> The running total behind an interest: each action adds its weight, and the total fades with time. Interest is R divided by R plus K.</w:t>
-      </w:r>
-    </w:p>
-    <w:p>
-      <w:pPr>
-        <w:spacing w:after="120" w:line="276"/>
-      </w:pPr>
-      <w:r>
-        <w:rPr>
-          <w:rFonts w:ascii="Calibri" w:cs="Calibri" w:eastAsia="Calibri" w:hAnsi="Calibri"/>
-          <w:b/>
-          <w:bCs/>
-          <w:color w:val="1A1A1A"/>
-          <w:sz w:val="21"/>
-          <w:szCs w:val="21"/>
-        </w:rPr>
-        <w:t xml:space="preserve">Receipt.</w:t>
-      </w:r>
-      <w:r>
-        <w:rPr>
-          <w:rFonts w:ascii="Calibri" w:cs="Calibri" w:eastAsia="Calibri" w:hAnsi="Calibri"/>
-          <w:color w:val="1A1A1A"/>
-          <w:sz w:val="21"/>
-          <w:szCs w:val="21"/>
-        </w:rPr>
-        <w:t xml:space="preserve"> The record of one served decision: what was served, in what position, and the arithmetic behind it, with the revisions of the published documents in force, so a person can recompute it. It is written after the answer, with the visitor's consent. Say receipt, never explain record; the page's own answer carries the shorter drivers.</w:t>
-      </w:r>
-    </w:p>
-    <w:p>
-      <w:pPr>
-        <w:spacing w:after="120" w:line="276"/>
-      </w:pPr>
-      <w:r>
-        <w:rPr>
-          <w:rFonts w:ascii="Calibri" w:cs="Calibri" w:eastAsia="Calibri" w:hAnsi="Calibri"/>
-          <w:b/>
-          <w:bCs/>
-          <w:color w:val="1A1A1A"/>
-          <w:sz w:val="21"/>
-          <w:szCs w:val="21"/>
-        </w:rPr>
-        <w:t xml:space="preserve">Recording.</w:t>
-      </w:r>
-      <w:r>
-        <w:rPr>
-          <w:rFonts w:ascii="Calibri" w:cs="Calibri" w:eastAsia="Calibri" w:hAnsi="Calibri"/>
-          <w:color w:val="1A1A1A"/>
-          <w:sz w:val="21"/>
-          <w:szCs w:val="21"/>
-        </w:rPr>
-        <w:t xml:space="preserve"> Writing receipts, outcomes and learning counts after an answer, with the visitor's consent. It runs from the first day, so what works is known before the brand turns the learning dial.</w:t>
-      </w:r>
-    </w:p>
-    <w:p>
-      <w:pPr>
-        <w:spacing w:after="120" w:line="276"/>
-      </w:pPr>
-      <w:r>
-        <w:rPr>
-          <w:rFonts w:ascii="Calibri" w:cs="Calibri" w:eastAsia="Calibri" w:hAnsi="Calibri"/>
-          <w:b/>
-          <w:bCs/>
-          <w:color w:val="1A1A1A"/>
-          <w:sz w:val="21"/>
-          <w:szCs w:val="21"/>
-        </w:rPr>
-        <w:t xml:space="preserve">Reflex.</w:t>
-      </w:r>
-      <w:r>
-        <w:rPr>
-          <w:rFonts w:ascii="Calibri" w:cs="Calibri" w:eastAsia="Calibri" w:hAnsi="Calibri"/>
-          <w:color w:val="1A1A1A"/>
-          <w:sz w:val="21"/>
-          <w:szCs w:val="21"/>
-        </w:rPr>
-        <w:t xml:space="preserve"> Deprecated: older material uses it for the engine, for a program kept per visitor and for the registry. Say the engine, or the registry.</w:t>
-      </w:r>
-    </w:p>
-    <w:p>
-      <w:pPr>
-        <w:spacing w:after="120" w:line="276"/>
-      </w:pPr>
-      <w:r>
-        <w:rPr>
-          <w:rFonts w:ascii="Calibri" w:cs="Calibri" w:eastAsia="Calibri" w:hAnsi="Calibri"/>
-          <w:b/>
-          <w:bCs/>
-          <w:color w:val="1A1A1A"/>
-          <w:sz w:val="21"/>
-          <w:szCs w:val="21"/>
-        </w:rPr>
-        <w:t xml:space="preserve">Region.</w:t>
-      </w:r>
-      <w:r>
-        <w:rPr>
-          <w:rFonts w:ascii="Calibri" w:cs="Calibri" w:eastAsia="Calibri" w:hAnsi="Calibri"/>
-          <w:color w:val="1A1A1A"/>
-          <w:sz w:val="21"/>
-          <w:szCs w:val="21"/>
-        </w:rPr>
-        <w:t xml:space="preserve"> Where a request comes from, as Cloudflare's network resolves it, written as country and region, such as US-WA. In a demo the opening region is always the visitor's real one; a presenter may assert another, and it is labeled.</w:t>
-      </w:r>
-    </w:p>
-    <w:p>
-      <w:pPr>
-        <w:spacing w:after="120" w:line="276"/>
-      </w:pPr>
-      <w:r>
-        <w:rPr>
-          <w:rFonts w:ascii="Calibri" w:cs="Calibri" w:eastAsia="Calibri" w:hAnsi="Calibri"/>
-          <w:b/>
-          <w:bCs/>
-          <w:color w:val="1A1A1A"/>
-          <w:sz w:val="21"/>
-          <w:szCs w:val="21"/>
-        </w:rPr>
-        <w:t xml:space="preserve">Regional fallback.</w:t>
-      </w:r>
-      <w:r>
-        <w:rPr>
-          <w:rFonts w:ascii="Calibri" w:cs="Calibri" w:eastAsia="Calibri" w:hAnsi="Calibri"/>
-          <w:color w:val="1A1A1A"/>
-          <w:sz w:val="21"/>
-          <w:szCs w:val="21"/>
-        </w:rPr>
-        <w:t xml:space="preserve"> When a region has too few events to answer, the engine uses its country, and then everyone. Older material calls this the ladder.</w:t>
-      </w:r>
-    </w:p>
-    <w:p>
-      <w:pPr>
-        <w:spacing w:after="120" w:line="276"/>
-      </w:pPr>
-      <w:r>
-        <w:rPr>
-          <w:rFonts w:ascii="Calibri" w:cs="Calibri" w:eastAsia="Calibri" w:hAnsi="Calibri"/>
-          <w:b/>
-          <w:bCs/>
-          <w:color w:val="1A1A1A"/>
-          <w:sz w:val="21"/>
-          <w:szCs w:val="21"/>
-        </w:rPr>
-        <w:t xml:space="preserve">Regional prior (λ).</w:t>
-      </w:r>
-      <w:r>
-        <w:rPr>
-          <w:rFonts w:ascii="Calibri" w:cs="Calibri" w:eastAsia="Calibri" w:hAnsi="Calibri"/>
-          <w:color w:val="1A1A1A"/>
-          <w:sz w:val="21"/>
-          <w:szCs w:val="21"/>
-        </w:rPr>
-        <w:t xml:space="preserve"> What visitors in a stranger's region are interested in, blended with the stranger's own interests while their evidence is thin; λ is the region's share of the blend, 1 for a stranger and falling as their own interests grow. The region's counts come from the site's own events, with a memory of one day, and can start from the brand's own sales by region; they carry no visitor ids. The learn document turns it on or off, and demos seed synthetic regional data and label it.</w:t>
-      </w:r>
-    </w:p>
-    <w:p>
-      <w:pPr>
-        <w:spacing w:after="120" w:line="276"/>
-      </w:pPr>
-      <w:r>
-        <w:rPr>
-          <w:rFonts w:ascii="Calibri" w:cs="Calibri" w:eastAsia="Calibri" w:hAnsi="Calibri"/>
-          <w:b/>
-          <w:bCs/>
-          <w:color w:val="1A1A1A"/>
-          <w:sz w:val="21"/>
-          <w:szCs w:val="21"/>
-        </w:rPr>
-        <w:t xml:space="preserve">Registry.</w:t>
-      </w:r>
-      <w:r>
-        <w:rPr>
-          <w:rFonts w:ascii="Calibri" w:cs="Calibri" w:eastAsia="Calibri" w:hAnsi="Calibri"/>
-          <w:color w:val="1A1A1A"/>
-          <w:sz w:val="21"/>
-          <w:szCs w:val="21"/>
-        </w:rPr>
-        <w:t xml:space="preserve"> The brand's published list of dimensions, the attribute each one reads, how much each action counts and how long interest lasts. Engineers call it the reflex document.</w:t>
-      </w:r>
-    </w:p>
-    <w:p>
-      <w:pPr>
-        <w:spacing w:after="120" w:line="276"/>
-      </w:pPr>
-      <w:r>
-        <w:rPr>
-          <w:rFonts w:ascii="Calibri" w:cs="Calibri" w:eastAsia="Calibri" w:hAnsi="Calibri"/>
-          <w:b/>
-          <w:bCs/>
-          <w:color w:val="1A1A1A"/>
-          <w:sz w:val="21"/>
-          <w:szCs w:val="21"/>
-        </w:rPr>
-        <w:t xml:space="preserve">Replay.</w:t>
-      </w:r>
-      <w:r>
-        <w:rPr>
-          <w:rFonts w:ascii="Calibri" w:cs="Calibri" w:eastAsia="Calibri" w:hAnsi="Calibri"/>
-          <w:color w:val="1A1A1A"/>
-          <w:sz w:val="21"/>
-          <w:szCs w:val="21"/>
-        </w:rPr>
-        <w:t xml:space="preserve"> Recomputing a past decision from its receipt to show that it comes out the same. It is exact for one slot; never claim it for a whole page.</w:t>
-      </w:r>
-    </w:p>
-    <w:p>
-      <w:pPr>
-        <w:spacing w:after="120" w:line="276"/>
-      </w:pPr>
-      <w:r>
-        <w:rPr>
-          <w:rFonts w:ascii="Calibri" w:cs="Calibri" w:eastAsia="Calibri" w:hAnsi="Calibri"/>
-          <w:b/>
-          <w:bCs/>
-          <w:color w:val="1A1A1A"/>
-          <w:sz w:val="21"/>
-          <w:szCs w:val="21"/>
-        </w:rPr>
-        <w:t xml:space="preserve">Retention.</w:t>
-      </w:r>
-      <w:r>
-        <w:rPr>
-          <w:rFonts w:ascii="Calibri" w:cs="Calibri" w:eastAsia="Calibri" w:hAnsi="Calibri"/>
-          <w:color w:val="1A1A1A"/>
-          <w:sz w:val="21"/>
-          <w:szCs w:val="21"/>
-        </w:rPr>
-        <w:t xml:space="preserve"> How long each category of stored data is kept, set for each customer. A category with no period set captures nothing that depends on it.</w:t>
-      </w:r>
-    </w:p>
-    <w:p>
-      <w:pPr>
-        <w:spacing w:after="120" w:line="276"/>
-      </w:pPr>
-      <w:r>
-        <w:rPr>
-          <w:rFonts w:ascii="Calibri" w:cs="Calibri" w:eastAsia="Calibri" w:hAnsi="Calibri"/>
-          <w:b/>
-          <w:bCs/>
-          <w:color w:val="1A1A1A"/>
-          <w:sz w:val="21"/>
-          <w:szCs w:val="21"/>
-        </w:rPr>
-        <w:t xml:space="preserve">Revision.</w:t>
-      </w:r>
-      <w:r>
-        <w:rPr>
-          <w:rFonts w:ascii="Calibri" w:cs="Calibri" w:eastAsia="Calibri" w:hAnsi="Calibri"/>
-          <w:color w:val="1A1A1A"/>
-          <w:sz w:val="21"/>
-          <w:szCs w:val="21"/>
-        </w:rPr>
-        <w:t xml:space="preserve"> One saved version of one published document. A rollback writes the old value as a new revision, so the history always shows it.</w:t>
+        <w:t xml:space="preserve">Queue.</w:t>
+      </w:r>
+      <w:r>
+        <w:rPr>
+          <w:rFonts w:ascii="Calibri" w:cs="Calibri" w:eastAsia="Calibri" w:hAnsi="Calibri"/>
+          <w:color w:val="1A1A1A"/>
+          <w:sz w:val="21"/>
+          <w:szCs w:val="21"/>
+        </w:rPr>
+        <w:t xml:space="preserve"> A message queue: work handed off during a request and done moments later, such as writing receipts to the ledger.</w:t>
       </w:r>
     </w:p>
     <w:p>
@@ -3541,7 +3285,7 @@
           <w:sz w:val="25"/>
           <w:szCs w:val="25"/>
         </w:rPr>
-        <w:t xml:space="preserve">S</w:t>
+        <w:t xml:space="preserve">R</w:t>
       </w:r>
       <w:bookmarkEnd w:id="18"/>
     </w:p>
@@ -3558,416 +3302,291 @@
           <w:sz w:val="21"/>
           <w:szCs w:val="21"/>
         </w:rPr>
-        <w:t xml:space="preserve">Score.</w:t>
-      </w:r>
-      <w:r>
-        <w:rPr>
-          <w:rFonts w:ascii="Calibri" w:cs="Calibri" w:eastAsia="Calibri" w:hAnsi="Calibri"/>
-          <w:color w:val="1A1A1A"/>
-          <w:sz w:val="21"/>
-          <w:szCs w:val="21"/>
-        </w:rPr>
-        <w:t xml:space="preserve"> The number that ranks a piece for a visitor in a slot: the visitor's interests in the piece's tags, each multiplied by the slot's weight for that dimension and added up, then adjusted in a fixed order by arrival seeds, journey stage, freshness, fatigue, merchandising weights and, only once its dial is raised, learning. The brand's rules apply before any score.</w:t>
-      </w:r>
-    </w:p>
-    <w:p>
-      <w:pPr>
-        <w:spacing w:after="120" w:line="276"/>
-      </w:pPr>
-      <w:r>
-        <w:rPr>
-          <w:rFonts w:ascii="Calibri" w:cs="Calibri" w:eastAsia="Calibri" w:hAnsi="Calibri"/>
-          <w:b/>
-          <w:bCs/>
-          <w:color w:val="1A1A1A"/>
-          <w:sz w:val="21"/>
-          <w:szCs w:val="21"/>
-        </w:rPr>
-        <w:t xml:space="preserve">SDK.</w:t>
-      </w:r>
-      <w:r>
-        <w:rPr>
-          <w:rFonts w:ascii="Calibri" w:cs="Calibri" w:eastAsia="Calibri" w:hAnsi="Calibri"/>
-          <w:color w:val="1A1A1A"/>
-          <w:sz w:val="21"/>
-          <w:szCs w:val="21"/>
-        </w:rPr>
-        <w:t xml:space="preserve"> The engine's browser library, served by the platform: it sends events, receives decisions and lets the site render its defaults when no decision arrives in time. There is no native app SDK; never sell one as available.</w:t>
-      </w:r>
-    </w:p>
-    <w:p>
-      <w:pPr>
-        <w:spacing w:after="120" w:line="276"/>
-      </w:pPr>
-      <w:r>
-        <w:rPr>
-          <w:rFonts w:ascii="Calibri" w:cs="Calibri" w:eastAsia="Calibri" w:hAnsi="Calibri"/>
-          <w:b/>
-          <w:bCs/>
-          <w:color w:val="1A1A1A"/>
-          <w:sz w:val="21"/>
-          <w:szCs w:val="21"/>
-        </w:rPr>
-        <w:t xml:space="preserve">Seed.</w:t>
-      </w:r>
-      <w:r>
-        <w:rPr>
-          <w:rFonts w:ascii="Calibri" w:cs="Calibri" w:eastAsia="Calibri" w:hAnsi="Calibri"/>
-          <w:color w:val="1A1A1A"/>
-          <w:sz w:val="21"/>
-          <w:szCs w:val="21"/>
-        </w:rPr>
-        <w:t xml:space="preserve"> A rule that uses how a visitor arrived, before they have shown any interest: the campaign term, the arrival channel, the referring network or the operating system family of their phone. A seed adds a fixed amount to matching pieces, so the visitor's own interests overtake it as those interests grow; seeds are published on the slots document.</w:t>
-      </w:r>
-    </w:p>
-    <w:p>
-      <w:pPr>
-        <w:spacing w:after="120" w:line="276"/>
-      </w:pPr>
-      <w:r>
-        <w:rPr>
-          <w:rFonts w:ascii="Calibri" w:cs="Calibri" w:eastAsia="Calibri" w:hAnsi="Calibri"/>
-          <w:b/>
-          <w:bCs/>
-          <w:color w:val="1A1A1A"/>
-          <w:sz w:val="21"/>
-          <w:szCs w:val="21"/>
-        </w:rPr>
-        <w:t xml:space="preserve">Segment.</w:t>
-      </w:r>
-      <w:r>
-        <w:rPr>
-          <w:rFonts w:ascii="Calibri" w:cs="Calibri" w:eastAsia="Calibri" w:hAnsi="Calibri"/>
-          <w:color w:val="1A1A1A"/>
-          <w:sz w:val="21"/>
-          <w:szCs w:val="21"/>
-        </w:rPr>
-        <w:t xml:space="preserve"> Deprecated: say audience.</w:t>
-      </w:r>
-    </w:p>
-    <w:p>
-      <w:pPr>
-        <w:spacing w:after="120" w:line="276"/>
-      </w:pPr>
-      <w:r>
-        <w:rPr>
-          <w:rFonts w:ascii="Calibri" w:cs="Calibri" w:eastAsia="Calibri" w:hAnsi="Calibri"/>
-          <w:b/>
-          <w:bCs/>
-          <w:color w:val="1A1A1A"/>
-          <w:sz w:val="21"/>
-          <w:szCs w:val="21"/>
-        </w:rPr>
-        <w:t xml:space="preserve">Session.</w:t>
-      </w:r>
-      <w:r>
-        <w:rPr>
-          <w:rFonts w:ascii="Calibri" w:cs="Calibri" w:eastAsia="Calibri" w:hAnsi="Calibri"/>
-          <w:color w:val="1A1A1A"/>
-          <w:sz w:val="21"/>
-          <w:szCs w:val="21"/>
-        </w:rPr>
-        <w:t xml:space="preserve"> The visitor's time on the site, which this package follows from before they arrive to after they leave. Engineers also use the word for the signed pass the visitor's browser presents, which lasts at most 24 hours; that pass is the shopper capability.</w:t>
-      </w:r>
-    </w:p>
-    <w:p>
-      <w:pPr>
-        <w:spacing w:after="120" w:line="276"/>
-      </w:pPr>
-      <w:r>
-        <w:rPr>
-          <w:rFonts w:ascii="Calibri" w:cs="Calibri" w:eastAsia="Calibri" w:hAnsi="Calibri"/>
-          <w:b/>
-          <w:bCs/>
-          <w:color w:val="1A1A1A"/>
-          <w:sz w:val="21"/>
-          <w:szCs w:val="21"/>
-        </w:rPr>
-        <w:t xml:space="preserve">Session host, object host.</w:t>
-      </w:r>
-      <w:r>
-        <w:rPr>
-          <w:rFonts w:ascii="Calibri" w:cs="Calibri" w:eastAsia="Calibri" w:hAnsi="Calibri"/>
-          <w:color w:val="1A1A1A"/>
-          <w:sz w:val="21"/>
-          <w:szCs w:val="21"/>
-        </w:rPr>
-        <w:t xml:space="preserve"> The two places a visitor's interests can live: a record in KV (the session host) or a Durable Object of their own (the object host).</w:t>
-      </w:r>
-    </w:p>
-    <w:p>
-      <w:pPr>
-        <w:spacing w:after="120" w:line="276"/>
-      </w:pPr>
-      <w:r>
-        <w:rPr>
-          <w:rFonts w:ascii="Calibri" w:cs="Calibri" w:eastAsia="Calibri" w:hAnsi="Calibri"/>
-          <w:b/>
-          <w:bCs/>
-          <w:color w:val="1A1A1A"/>
-          <w:sz w:val="21"/>
-          <w:szCs w:val="21"/>
-        </w:rPr>
-        <w:t xml:space="preserve">Shopper.</w:t>
-      </w:r>
-      <w:r>
-        <w:rPr>
-          <w:rFonts w:ascii="Calibri" w:cs="Calibri" w:eastAsia="Calibri" w:hAnsi="Calibri"/>
-          <w:color w:val="1A1A1A"/>
-          <w:sz w:val="21"/>
-          <w:szCs w:val="21"/>
-        </w:rPr>
-        <w:t xml:space="preserve"> The same person as a visitor. Say visitor, except in a retail example.</w:t>
-      </w:r>
-    </w:p>
-    <w:p>
-      <w:pPr>
-        <w:spacing w:after="120" w:line="276"/>
-      </w:pPr>
-      <w:r>
-        <w:rPr>
-          <w:rFonts w:ascii="Calibri" w:cs="Calibri" w:eastAsia="Calibri" w:hAnsi="Calibri"/>
-          <w:b/>
-          <w:bCs/>
-          <w:color w:val="1A1A1A"/>
-          <w:sz w:val="21"/>
-          <w:szCs w:val="21"/>
-        </w:rPr>
-        <w:t xml:space="preserve">Shopper capability.</w:t>
-      </w:r>
-      <w:r>
-        <w:rPr>
-          <w:rFonts w:ascii="Calibri" w:cs="Calibri" w:eastAsia="Calibri" w:hAnsi="Calibri"/>
-          <w:color w:val="1A1A1A"/>
-          <w:sz w:val="21"/>
-          <w:szCs w:val="21"/>
-        </w:rPr>
-        <w:t xml:space="preserve"> The signed, short-lived pass the engine gives a visitor's browser for one session, valid for at most 24 hours, which the browser shows on every call. Ids the caller makes up and old cookies grant nothing without it.</w:t>
-      </w:r>
-    </w:p>
-    <w:p>
-      <w:pPr>
-        <w:spacing w:after="120" w:line="276"/>
-      </w:pPr>
-      <w:r>
-        <w:rPr>
-          <w:rFonts w:ascii="Calibri" w:cs="Calibri" w:eastAsia="Calibri" w:hAnsi="Calibri"/>
-          <w:b/>
-          <w:bCs/>
-          <w:color w:val="1A1A1A"/>
-          <w:sz w:val="21"/>
-          <w:szCs w:val="21"/>
-        </w:rPr>
-        <w:t xml:space="preserve">Sign-in merge.</w:t>
-      </w:r>
-      <w:r>
-        <w:rPr>
-          <w:rFonts w:ascii="Calibri" w:cs="Calibri" w:eastAsia="Calibri" w:hAnsi="Calibri"/>
-          <w:color w:val="1A1A1A"/>
-          <w:sz w:val="21"/>
-          <w:szCs w:val="21"/>
-        </w:rPr>
-        <w:t xml:space="preserve"> What happens when a visitor signs in: the brand's own server signs a proof of who they are, and their anonymous and signed-in profiles merge, adding interests and overriding nothing. Their account id is never stored as such; they are known by a hash of it, salted on every customer deployment.</w:t>
-      </w:r>
-    </w:p>
-    <w:p>
-      <w:pPr>
-        <w:spacing w:after="120" w:line="276"/>
-      </w:pPr>
-      <w:r>
-        <w:rPr>
-          <w:rFonts w:ascii="Calibri" w:cs="Calibri" w:eastAsia="Calibri" w:hAnsi="Calibri"/>
-          <w:b/>
-          <w:bCs/>
-          <w:color w:val="1A1A1A"/>
-          <w:sz w:val="21"/>
-          <w:szCs w:val="21"/>
-        </w:rPr>
-        <w:t xml:space="preserve">Signal system.</w:t>
-      </w:r>
-      <w:r>
-        <w:rPr>
-          <w:rFonts w:ascii="Calibri" w:cs="Calibri" w:eastAsia="Calibri" w:hAnsi="Calibri"/>
-          <w:color w:val="1A1A1A"/>
-          <w:sz w:val="21"/>
-          <w:szCs w:val="21"/>
-        </w:rPr>
-        <w:t xml:space="preserve"> Deprecated: one demo's name for the engine. Say the engine.</w:t>
-      </w:r>
-    </w:p>
-    <w:p>
-      <w:pPr>
-        <w:spacing w:after="120" w:line="276"/>
-      </w:pPr>
-      <w:r>
-        <w:rPr>
-          <w:rFonts w:ascii="Calibri" w:cs="Calibri" w:eastAsia="Calibri" w:hAnsi="Calibri"/>
-          <w:b/>
-          <w:bCs/>
-          <w:color w:val="1A1A1A"/>
-          <w:sz w:val="21"/>
-          <w:szCs w:val="21"/>
-        </w:rPr>
-        <w:t xml:space="preserve">Site key.</w:t>
-      </w:r>
-      <w:r>
-        <w:rPr>
-          <w:rFonts w:ascii="Calibri" w:cs="Calibri" w:eastAsia="Calibri" w:hAnsi="Calibri"/>
-          <w:color w:val="1A1A1A"/>
-          <w:sz w:val="21"/>
-          <w:szCs w:val="21"/>
-        </w:rPr>
-        <w:t xml:space="preserve"> The key that identifies the brand's site on every call from its pages. It is not a secret; the engine checks that it belongs to the brand being called.</w:t>
-      </w:r>
-    </w:p>
-    <w:p>
-      <w:pPr>
-        <w:spacing w:after="120" w:line="276"/>
-      </w:pPr>
-      <w:r>
-        <w:rPr>
-          <w:rFonts w:ascii="Calibri" w:cs="Calibri" w:eastAsia="Calibri" w:hAnsi="Calibri"/>
-          <w:b/>
-          <w:bCs/>
-          <w:color w:val="1A1A1A"/>
-          <w:sz w:val="21"/>
-          <w:szCs w:val="21"/>
-        </w:rPr>
-        <w:t xml:space="preserve">Slot.</w:t>
-      </w:r>
-      <w:r>
-        <w:rPr>
-          <w:rFonts w:ascii="Calibri" w:cs="Calibri" w:eastAsia="Calibri" w:hAnsi="Calibri"/>
-          <w:color w:val="1A1A1A"/>
-          <w:sz w:val="21"/>
-          <w:szCs w:val="21"/>
-        </w:rPr>
-        <w:t xml:space="preserve"> One place on one page that the engine decides, showing one or more pieces in order. Older material says container, frame or zone; say slot.</w:t>
-      </w:r>
-    </w:p>
-    <w:p>
-      <w:pPr>
-        <w:spacing w:after="120" w:line="276"/>
-      </w:pPr>
-      <w:r>
-        <w:rPr>
-          <w:rFonts w:ascii="Calibri" w:cs="Calibri" w:eastAsia="Calibri" w:hAnsi="Calibri"/>
-          <w:b/>
-          <w:bCs/>
-          <w:color w:val="1A1A1A"/>
-          <w:sz w:val="21"/>
-          <w:szCs w:val="21"/>
-        </w:rPr>
-        <w:t xml:space="preserve">Slot weight (ω).</w:t>
-      </w:r>
-      <w:r>
-        <w:rPr>
-          <w:rFonts w:ascii="Calibri" w:cs="Calibri" w:eastAsia="Calibri" w:hAnsi="Calibri"/>
-          <w:color w:val="1A1A1A"/>
-          <w:sz w:val="21"/>
-          <w:szCs w:val="21"/>
-        </w:rPr>
-        <w:t xml:space="preserve"> How much a dimension counts in a slot, from 0 to 1, so one slot can favor brand and another category. The brand sets it in the slots document.</w:t>
-      </w:r>
-    </w:p>
-    <w:p>
-      <w:pPr>
-        <w:spacing w:after="120" w:line="276"/>
-      </w:pPr>
-      <w:r>
-        <w:rPr>
-          <w:rFonts w:ascii="Calibri" w:cs="Calibri" w:eastAsia="Calibri" w:hAnsi="Calibri"/>
-          <w:b/>
-          <w:bCs/>
-          <w:color w:val="1A1A1A"/>
-          <w:sz w:val="21"/>
-          <w:szCs w:val="21"/>
-        </w:rPr>
-        <w:t xml:space="preserve">Slots document.</w:t>
-      </w:r>
-      <w:r>
-        <w:rPr>
-          <w:rFonts w:ascii="Calibri" w:cs="Calibri" w:eastAsia="Calibri" w:hAnsi="Calibri"/>
-          <w:color w:val="1A1A1A"/>
-          <w:sz w:val="21"/>
-          <w:szCs w:val="21"/>
-        </w:rPr>
-        <w:t xml:space="preserve"> The published document that lists the brand's pages and their slots, with each slot's take, weights, pins, rules and arrival seeds.</w:t>
-      </w:r>
-    </w:p>
-    <w:p>
-      <w:pPr>
-        <w:spacing w:after="120" w:line="276"/>
-      </w:pPr>
-      <w:r>
-        <w:rPr>
-          <w:rFonts w:ascii="Calibri" w:cs="Calibri" w:eastAsia="Calibri" w:hAnsi="Calibri"/>
-          <w:b/>
-          <w:bCs/>
-          <w:color w:val="1A1A1A"/>
-          <w:sz w:val="21"/>
-          <w:szCs w:val="21"/>
-        </w:rPr>
-        <w:t xml:space="preserve">Stage.</w:t>
-      </w:r>
-      <w:r>
-        <w:rPr>
-          <w:rFonts w:ascii="Calibri" w:cs="Calibri" w:eastAsia="Calibri" w:hAnsi="Calibri"/>
-          <w:color w:val="1A1A1A"/>
-          <w:sz w:val="21"/>
-          <w:szCs w:val="21"/>
-        </w:rPr>
-        <w:t xml:space="preserve"> Deprecated on its own: say journey stage, the only stage in this package. Never call a part of learning, or a step in delivering the product, a stage.</w:t>
-      </w:r>
-    </w:p>
-    <w:p>
-      <w:pPr>
-        <w:spacing w:after="120" w:line="276"/>
-      </w:pPr>
-      <w:r>
-        <w:rPr>
-          <w:rFonts w:ascii="Calibri" w:cs="Calibri" w:eastAsia="Calibri" w:hAnsi="Calibri"/>
-          <w:b/>
-          <w:bCs/>
-          <w:color w:val="1A1A1A"/>
-          <w:sz w:val="21"/>
-          <w:szCs w:val="21"/>
-        </w:rPr>
-        <w:t xml:space="preserve">Stamp.</w:t>
-      </w:r>
-      <w:r>
-        <w:rPr>
-          <w:rFonts w:ascii="Calibri" w:cs="Calibri" w:eastAsia="Calibri" w:hAnsi="Calibri"/>
-          <w:color w:val="1A1A1A"/>
-          <w:sz w:val="21"/>
-          <w:szCs w:val="21"/>
-        </w:rPr>
-        <w:t xml:space="preserve"> Deprecated for readers: say customer deployment. It is the engineers' word for one: one Worker per environment, with its own storage.</w:t>
-      </w:r>
-    </w:p>
-    <w:p>
-      <w:pPr>
-        <w:spacing w:after="120" w:line="276"/>
-      </w:pPr>
-      <w:r>
-        <w:rPr>
-          <w:rFonts w:ascii="Calibri" w:cs="Calibri" w:eastAsia="Calibri" w:hAnsi="Calibri"/>
-          <w:b/>
-          <w:bCs/>
-          <w:color w:val="1A1A1A"/>
-          <w:sz w:val="21"/>
-          <w:szCs w:val="21"/>
-        </w:rPr>
-        <w:t xml:space="preserve">Synthetic.</w:t>
-      </w:r>
-      <w:r>
-        <w:rPr>
-          <w:rFonts w:ascii="Calibri" w:cs="Calibri" w:eastAsia="Calibri" w:hAnsi="Calibri"/>
-          <w:color w:val="1A1A1A"/>
-          <w:sz w:val="21"/>
-          <w:szCs w:val="21"/>
-        </w:rPr>
-        <w:t xml:space="preserve"> Made up for a demo and labeled as such on screen, such as the regional sales behind a demo's cold start. Synthetic data is never presented as a customer's own.</w:t>
+        <w:t xml:space="preserve">R2.</w:t>
+      </w:r>
+      <w:r>
+        <w:rPr>
+          <w:rFonts w:ascii="Calibri" w:cs="Calibri" w:eastAsia="Calibri" w:hAnsi="Calibri"/>
+          <w:color w:val="1A1A1A"/>
+          <w:sz w:val="21"/>
+          <w:szCs w:val="21"/>
+        </w:rPr>
+        <w:t xml:space="preserve"> Cloudflare's file storage. The engine keeps the published documents, the ledger and the day reports there.</w:t>
+      </w:r>
+    </w:p>
+    <w:p>
+      <w:pPr>
+        <w:spacing w:after="120" w:line="276"/>
+      </w:pPr>
+      <w:r>
+        <w:rPr>
+          <w:rFonts w:ascii="Calibri" w:cs="Calibri" w:eastAsia="Calibri" w:hAnsi="Calibri"/>
+          <w:b/>
+          <w:bCs/>
+          <w:color w:val="1A1A1A"/>
+          <w:sz w:val="21"/>
+          <w:szCs w:val="21"/>
+        </w:rPr>
+        <w:t xml:space="preserve">Raw score (R).</w:t>
+      </w:r>
+      <w:r>
+        <w:rPr>
+          <w:rFonts w:ascii="Calibri" w:cs="Calibri" w:eastAsia="Calibri" w:hAnsi="Calibri"/>
+          <w:color w:val="1A1A1A"/>
+          <w:sz w:val="21"/>
+          <w:szCs w:val="21"/>
+        </w:rPr>
+        <w:t xml:space="preserve"> The running total behind an interest: each action adds its weight, and the total fades with time. Interest is R divided by R plus K.</w:t>
+      </w:r>
+    </w:p>
+    <w:p>
+      <w:pPr>
+        <w:spacing w:after="120" w:line="276"/>
+      </w:pPr>
+      <w:r>
+        <w:rPr>
+          <w:rFonts w:ascii="Calibri" w:cs="Calibri" w:eastAsia="Calibri" w:hAnsi="Calibri"/>
+          <w:b/>
+          <w:bCs/>
+          <w:color w:val="1A1A1A"/>
+          <w:sz w:val="21"/>
+          <w:szCs w:val="21"/>
+        </w:rPr>
+        <w:t xml:space="preserve">Receipt.</w:t>
+      </w:r>
+      <w:r>
+        <w:rPr>
+          <w:rFonts w:ascii="Calibri" w:cs="Calibri" w:eastAsia="Calibri" w:hAnsi="Calibri"/>
+          <w:color w:val="1A1A1A"/>
+          <w:sz w:val="21"/>
+          <w:szCs w:val="21"/>
+        </w:rPr>
+        <w:t xml:space="preserve"> The record of one served decision: what was served, in what position, and the arithmetic behind it, with the revisions of the published documents in force, so a person can recompute it. It is written after the answer, with the visitor's consent. Say receipt, never explain record; the page's own answer carries the shorter drivers.</w:t>
+      </w:r>
+    </w:p>
+    <w:p>
+      <w:pPr>
+        <w:spacing w:after="120" w:line="276"/>
+      </w:pPr>
+      <w:r>
+        <w:rPr>
+          <w:rFonts w:ascii="Calibri" w:cs="Calibri" w:eastAsia="Calibri" w:hAnsi="Calibri"/>
+          <w:b/>
+          <w:bCs/>
+          <w:color w:val="1A1A1A"/>
+          <w:sz w:val="21"/>
+          <w:szCs w:val="21"/>
+        </w:rPr>
+        <w:t xml:space="preserve">Recording.</w:t>
+      </w:r>
+      <w:r>
+        <w:rPr>
+          <w:rFonts w:ascii="Calibri" w:cs="Calibri" w:eastAsia="Calibri" w:hAnsi="Calibri"/>
+          <w:color w:val="1A1A1A"/>
+          <w:sz w:val="21"/>
+          <w:szCs w:val="21"/>
+        </w:rPr>
+        <w:t xml:space="preserve"> Writing receipts, outcomes and learning counts after an answer, with the visitor's consent. It runs from the first day, so what works is known before the brand turns the learning dial.</w:t>
+      </w:r>
+    </w:p>
+    <w:p>
+      <w:pPr>
+        <w:spacing w:after="120" w:line="276"/>
+      </w:pPr>
+      <w:r>
+        <w:rPr>
+          <w:rFonts w:ascii="Calibri" w:cs="Calibri" w:eastAsia="Calibri" w:hAnsi="Calibri"/>
+          <w:b/>
+          <w:bCs/>
+          <w:color w:val="1A1A1A"/>
+          <w:sz w:val="21"/>
+          <w:szCs w:val="21"/>
+        </w:rPr>
+        <w:t xml:space="preserve">Reflex.</w:t>
+      </w:r>
+      <w:r>
+        <w:rPr>
+          <w:rFonts w:ascii="Calibri" w:cs="Calibri" w:eastAsia="Calibri" w:hAnsi="Calibri"/>
+          <w:color w:val="1A1A1A"/>
+          <w:sz w:val="21"/>
+          <w:szCs w:val="21"/>
+        </w:rPr>
+        <w:t xml:space="preserve"> Deprecated: older material uses it for the engine, for a program kept per visitor and for the registry. Say the engine, or the registry.</w:t>
+      </w:r>
+    </w:p>
+    <w:p>
+      <w:pPr>
+        <w:spacing w:after="120" w:line="276"/>
+      </w:pPr>
+      <w:r>
+        <w:rPr>
+          <w:rFonts w:ascii="Calibri" w:cs="Calibri" w:eastAsia="Calibri" w:hAnsi="Calibri"/>
+          <w:b/>
+          <w:bCs/>
+          <w:color w:val="1A1A1A"/>
+          <w:sz w:val="21"/>
+          <w:szCs w:val="21"/>
+        </w:rPr>
+        <w:t xml:space="preserve">Region.</w:t>
+      </w:r>
+      <w:r>
+        <w:rPr>
+          <w:rFonts w:ascii="Calibri" w:cs="Calibri" w:eastAsia="Calibri" w:hAnsi="Calibri"/>
+          <w:color w:val="1A1A1A"/>
+          <w:sz w:val="21"/>
+          <w:szCs w:val="21"/>
+        </w:rPr>
+        <w:t xml:space="preserve"> Where a request comes from, as Cloudflare's network resolves it, written as country and region, such as US-WA. In a demo the opening region is always the visitor's real one; a presenter may assert another, and it is labeled.</w:t>
+      </w:r>
+    </w:p>
+    <w:p>
+      <w:pPr>
+        <w:spacing w:after="120" w:line="276"/>
+      </w:pPr>
+      <w:r>
+        <w:rPr>
+          <w:rFonts w:ascii="Calibri" w:cs="Calibri" w:eastAsia="Calibri" w:hAnsi="Calibri"/>
+          <w:b/>
+          <w:bCs/>
+          <w:color w:val="1A1A1A"/>
+          <w:sz w:val="21"/>
+          <w:szCs w:val="21"/>
+        </w:rPr>
+        <w:t xml:space="preserve">Regional fallback.</w:t>
+      </w:r>
+      <w:r>
+        <w:rPr>
+          <w:rFonts w:ascii="Calibri" w:cs="Calibri" w:eastAsia="Calibri" w:hAnsi="Calibri"/>
+          <w:color w:val="1A1A1A"/>
+          <w:sz w:val="21"/>
+          <w:szCs w:val="21"/>
+        </w:rPr>
+        <w:t xml:space="preserve"> When a region has too few events to answer, the engine uses its country, and then everyone. Older material calls this the ladder.</w:t>
+      </w:r>
+    </w:p>
+    <w:p>
+      <w:pPr>
+        <w:spacing w:after="120" w:line="276"/>
+      </w:pPr>
+      <w:r>
+        <w:rPr>
+          <w:rFonts w:ascii="Calibri" w:cs="Calibri" w:eastAsia="Calibri" w:hAnsi="Calibri"/>
+          <w:b/>
+          <w:bCs/>
+          <w:color w:val="1A1A1A"/>
+          <w:sz w:val="21"/>
+          <w:szCs w:val="21"/>
+        </w:rPr>
+        <w:t xml:space="preserve">Regional prior (λ).</w:t>
+      </w:r>
+      <w:r>
+        <w:rPr>
+          <w:rFonts w:ascii="Calibri" w:cs="Calibri" w:eastAsia="Calibri" w:hAnsi="Calibri"/>
+          <w:color w:val="1A1A1A"/>
+          <w:sz w:val="21"/>
+          <w:szCs w:val="21"/>
+        </w:rPr>
+        <w:t xml:space="preserve"> What visitors in a stranger's region are interested in, blended with the stranger's own interests while their evidence is thin; λ is the region's share of the blend, 1 for a stranger and falling as their own interests grow. The region's counts come from the site's own events, with a memory of one day, and can start from the brand's own sales by region; they carry no visitor ids. The learn document turns it on or off, and demos seed synthetic regional data and label it.</w:t>
+      </w:r>
+    </w:p>
+    <w:p>
+      <w:pPr>
+        <w:spacing w:after="120" w:line="276"/>
+      </w:pPr>
+      <w:r>
+        <w:rPr>
+          <w:rFonts w:ascii="Calibri" w:cs="Calibri" w:eastAsia="Calibri" w:hAnsi="Calibri"/>
+          <w:b/>
+          <w:bCs/>
+          <w:color w:val="1A1A1A"/>
+          <w:sz w:val="21"/>
+          <w:szCs w:val="21"/>
+        </w:rPr>
+        <w:t xml:space="preserve">Registry.</w:t>
+      </w:r>
+      <w:r>
+        <w:rPr>
+          <w:rFonts w:ascii="Calibri" w:cs="Calibri" w:eastAsia="Calibri" w:hAnsi="Calibri"/>
+          <w:color w:val="1A1A1A"/>
+          <w:sz w:val="21"/>
+          <w:szCs w:val="21"/>
+        </w:rPr>
+        <w:t xml:space="preserve"> The brand's published list of dimensions, the attribute each one reads, how much each action counts and how long interest lasts. Engineers call it the reflex document.</w:t>
+      </w:r>
+    </w:p>
+    <w:p>
+      <w:pPr>
+        <w:spacing w:after="120" w:line="276"/>
+      </w:pPr>
+      <w:r>
+        <w:rPr>
+          <w:rFonts w:ascii="Calibri" w:cs="Calibri" w:eastAsia="Calibri" w:hAnsi="Calibri"/>
+          <w:b/>
+          <w:bCs/>
+          <w:color w:val="1A1A1A"/>
+          <w:sz w:val="21"/>
+          <w:szCs w:val="21"/>
+        </w:rPr>
+        <w:t xml:space="preserve">Replay.</w:t>
+      </w:r>
+      <w:r>
+        <w:rPr>
+          <w:rFonts w:ascii="Calibri" w:cs="Calibri" w:eastAsia="Calibri" w:hAnsi="Calibri"/>
+          <w:color w:val="1A1A1A"/>
+          <w:sz w:val="21"/>
+          <w:szCs w:val="21"/>
+        </w:rPr>
+        <w:t xml:space="preserve"> Recomputing a past decision from its receipt to show that it comes out the same. It is exact for one slot; never claim it for a whole page.</w:t>
+      </w:r>
+    </w:p>
+    <w:p>
+      <w:pPr>
+        <w:spacing w:after="120" w:line="276"/>
+      </w:pPr>
+      <w:r>
+        <w:rPr>
+          <w:rFonts w:ascii="Calibri" w:cs="Calibri" w:eastAsia="Calibri" w:hAnsi="Calibri"/>
+          <w:b/>
+          <w:bCs/>
+          <w:color w:val="1A1A1A"/>
+          <w:sz w:val="21"/>
+          <w:szCs w:val="21"/>
+        </w:rPr>
+        <w:t xml:space="preserve">Retention.</w:t>
+      </w:r>
+      <w:r>
+        <w:rPr>
+          <w:rFonts w:ascii="Calibri" w:cs="Calibri" w:eastAsia="Calibri" w:hAnsi="Calibri"/>
+          <w:color w:val="1A1A1A"/>
+          <w:sz w:val="21"/>
+          <w:szCs w:val="21"/>
+        </w:rPr>
+        <w:t xml:space="preserve"> How long each category of stored data is kept, set for each customer. A category with no period set captures nothing that depends on it.</w:t>
+      </w:r>
+    </w:p>
+    <w:p>
+      <w:pPr>
+        <w:spacing w:after="120" w:line="276"/>
+      </w:pPr>
+      <w:r>
+        <w:rPr>
+          <w:rFonts w:ascii="Calibri" w:cs="Calibri" w:eastAsia="Calibri" w:hAnsi="Calibri"/>
+          <w:b/>
+          <w:bCs/>
+          <w:color w:val="1A1A1A"/>
+          <w:sz w:val="21"/>
+          <w:szCs w:val="21"/>
+        </w:rPr>
+        <w:t xml:space="preserve">Revision.</w:t>
+      </w:r>
+      <w:r>
+        <w:rPr>
+          <w:rFonts w:ascii="Calibri" w:cs="Calibri" w:eastAsia="Calibri" w:hAnsi="Calibri"/>
+          <w:color w:val="1A1A1A"/>
+          <w:sz w:val="21"/>
+          <w:szCs w:val="21"/>
+        </w:rPr>
+        <w:t xml:space="preserve"> One saved version of one published document. A rollback writes the old value as a new revision, so the history always shows it.</w:t>
       </w:r>
     </w:p>
     <w:p>
@@ -3985,7 +3604,7 @@
           <w:sz w:val="25"/>
           <w:szCs w:val="25"/>
         </w:rPr>
-        <w:t xml:space="preserve">T</w:t>
+        <w:t xml:space="preserve">S</w:t>
       </w:r>
       <w:bookmarkEnd w:id="19"/>
     </w:p>
@@ -4002,141 +3621,416 @@
           <w:sz w:val="21"/>
           <w:szCs w:val="21"/>
         </w:rPr>
-        <w:t xml:space="preserve">Tag.</w:t>
-      </w:r>
-      <w:r>
-        <w:rPr>
-          <w:rFonts w:ascii="Calibri" w:cs="Calibri" w:eastAsia="Calibri" w:hAnsi="Calibri"/>
-          <w:color w:val="1A1A1A"/>
-          <w:sz w:val="21"/>
-          <w:szCs w:val="21"/>
-        </w:rPr>
-        <w:t xml:space="preserve"> A dimension value written on a piece, such as brand: samsung, so the engine can score the piece against a visitor's interests. Tags use the registry's vocabulary.</w:t>
-      </w:r>
-    </w:p>
-    <w:p>
-      <w:pPr>
-        <w:spacing w:after="120" w:line="276"/>
-      </w:pPr>
-      <w:r>
-        <w:rPr>
-          <w:rFonts w:ascii="Calibri" w:cs="Calibri" w:eastAsia="Calibri" w:hAnsi="Calibri"/>
-          <w:b/>
-          <w:bCs/>
-          <w:color w:val="1A1A1A"/>
-          <w:sz w:val="21"/>
-          <w:szCs w:val="21"/>
-        </w:rPr>
-        <w:t xml:space="preserve">Take.</w:t>
-      </w:r>
-      <w:r>
-        <w:rPr>
-          <w:rFonts w:ascii="Calibri" w:cs="Calibri" w:eastAsia="Calibri" w:hAnsi="Calibri"/>
-          <w:color w:val="1A1A1A"/>
-          <w:sz w:val="21"/>
-          <w:szCs w:val="21"/>
-        </w:rPr>
-        <w:t xml:space="preserve"> How many pieces a slot shows, from 1 to 50.</w:t>
-      </w:r>
-    </w:p>
-    <w:p>
-      <w:pPr>
-        <w:spacing w:after="120" w:line="276"/>
-      </w:pPr>
-      <w:r>
-        <w:rPr>
-          <w:rFonts w:ascii="Calibri" w:cs="Calibri" w:eastAsia="Calibri" w:hAnsi="Calibri"/>
-          <w:b/>
-          <w:bCs/>
-          <w:color w:val="1A1A1A"/>
-          <w:sz w:val="21"/>
-          <w:szCs w:val="21"/>
-        </w:rPr>
-        <w:t xml:space="preserve">Tenant.</w:t>
-      </w:r>
-      <w:r>
-        <w:rPr>
-          <w:rFonts w:ascii="Calibri" w:cs="Calibri" w:eastAsia="Calibri" w:hAnsi="Calibri"/>
-          <w:color w:val="1A1A1A"/>
-          <w:sz w:val="21"/>
-          <w:szCs w:val="21"/>
-        </w:rPr>
-        <w:t xml:space="preserve"> One brand's isolated space inside a deployment: everything it owns is kept under its own prefix, and nothing pools across brands. Engineers declare a deployment's tenants, and a page names its tenant on every call.</w:t>
-      </w:r>
-    </w:p>
-    <w:p>
-      <w:pPr>
-        <w:spacing w:after="120" w:line="276"/>
-      </w:pPr>
-      <w:r>
-        <w:rPr>
-          <w:rFonts w:ascii="Calibri" w:cs="Calibri" w:eastAsia="Calibri" w:hAnsi="Calibri"/>
-          <w:b/>
-          <w:bCs/>
-          <w:color w:val="1A1A1A"/>
-          <w:sz w:val="21"/>
-          <w:szCs w:val="21"/>
-        </w:rPr>
-        <w:t xml:space="preserve">Touch.</w:t>
-      </w:r>
-      <w:r>
-        <w:rPr>
-          <w:rFonts w:ascii="Calibri" w:cs="Calibri" w:eastAsia="Calibri" w:hAnsi="Calibri"/>
-          <w:color w:val="1A1A1A"/>
-          <w:sz w:val="21"/>
-          <w:szCs w:val="21"/>
-        </w:rPr>
-        <w:t xml:space="preserve"> One hit on one dimension value that an event produces: a single product view can touch its brand, its category and its price band at once. Each touch adds the action's weight to that value's raw score.</w:t>
-      </w:r>
-    </w:p>
-    <w:p>
-      <w:pPr>
-        <w:spacing w:after="120" w:line="276"/>
-      </w:pPr>
-      <w:r>
-        <w:rPr>
-          <w:rFonts w:ascii="Calibri" w:cs="Calibri" w:eastAsia="Calibri" w:hAnsi="Calibri"/>
-          <w:b/>
-          <w:bCs/>
-          <w:color w:val="1A1A1A"/>
-          <w:sz w:val="21"/>
-          <w:szCs w:val="21"/>
-        </w:rPr>
-        <w:t xml:space="preserve">Trust dial.</w:t>
-      </w:r>
-      <w:r>
-        <w:rPr>
-          <w:rFonts w:ascii="Calibri" w:cs="Calibri" w:eastAsia="Calibri" w:hAnsi="Calibri"/>
-          <w:color w:val="1A1A1A"/>
-          <w:sz w:val="21"/>
-          <w:szCs w:val="21"/>
-        </w:rPr>
-        <w:t xml:space="preserve"> Deprecated: say learning dial.</w:t>
-      </w:r>
-    </w:p>
-    <w:p>
-      <w:pPr>
-        <w:spacing w:after="120" w:line="276"/>
-      </w:pPr>
-      <w:r>
-        <w:rPr>
-          <w:rFonts w:ascii="Calibri" w:cs="Calibri" w:eastAsia="Calibri" w:hAnsi="Calibri"/>
-          <w:b/>
-          <w:bCs/>
-          <w:color w:val="1A1A1A"/>
-          <w:sz w:val="21"/>
-          <w:szCs w:val="21"/>
-        </w:rPr>
-        <w:t xml:space="preserve">Typed search.</w:t>
-      </w:r>
-      <w:r>
-        <w:rPr>
-          <w:rFonts w:ascii="Calibri" w:cs="Calibri" w:eastAsia="Calibri" w:hAnsi="Calibri"/>
-          <w:color w:val="1A1A1A"/>
-          <w:sz w:val="21"/>
-          <w:szCs w:val="21"/>
-        </w:rPr>
-        <w:t xml:space="preserve"> Search in which an AI model reads what the visitor types, the brand's catalog search fetches results, and the engine ranks them for that visitor; also called AI search. It is one of the optional AI add-ons, outside the decision, which a brand switches on with its credits.</w:t>
+        <w:t xml:space="preserve">Score.</w:t>
+      </w:r>
+      <w:r>
+        <w:rPr>
+          <w:rFonts w:ascii="Calibri" w:cs="Calibri" w:eastAsia="Calibri" w:hAnsi="Calibri"/>
+          <w:color w:val="1A1A1A"/>
+          <w:sz w:val="21"/>
+          <w:szCs w:val="21"/>
+        </w:rPr>
+        <w:t xml:space="preserve"> The number that ranks a piece for a visitor in a slot: the visitor's interests in the piece's tags, each multiplied by the slot's weight for that dimension and added up, then adjusted in a fixed order by arrival seeds, journey stage, freshness, fatigue, merchandising weights and, only once its dial is raised, learning. The brand's rules apply before any score.</w:t>
+      </w:r>
+    </w:p>
+    <w:p>
+      <w:pPr>
+        <w:spacing w:after="120" w:line="276"/>
+      </w:pPr>
+      <w:r>
+        <w:rPr>
+          <w:rFonts w:ascii="Calibri" w:cs="Calibri" w:eastAsia="Calibri" w:hAnsi="Calibri"/>
+          <w:b/>
+          <w:bCs/>
+          <w:color w:val="1A1A1A"/>
+          <w:sz w:val="21"/>
+          <w:szCs w:val="21"/>
+        </w:rPr>
+        <w:t xml:space="preserve">SDK.</w:t>
+      </w:r>
+      <w:r>
+        <w:rPr>
+          <w:rFonts w:ascii="Calibri" w:cs="Calibri" w:eastAsia="Calibri" w:hAnsi="Calibri"/>
+          <w:color w:val="1A1A1A"/>
+          <w:sz w:val="21"/>
+          <w:szCs w:val="21"/>
+        </w:rPr>
+        <w:t xml:space="preserve"> The engine's browser library, served by the platform: it sends events, receives decisions and lets the site render its defaults when no decision arrives in time. There is no native app SDK; never sell one as available.</w:t>
+      </w:r>
+    </w:p>
+    <w:p>
+      <w:pPr>
+        <w:spacing w:after="120" w:line="276"/>
+      </w:pPr>
+      <w:r>
+        <w:rPr>
+          <w:rFonts w:ascii="Calibri" w:cs="Calibri" w:eastAsia="Calibri" w:hAnsi="Calibri"/>
+          <w:b/>
+          <w:bCs/>
+          <w:color w:val="1A1A1A"/>
+          <w:sz w:val="21"/>
+          <w:szCs w:val="21"/>
+        </w:rPr>
+        <w:t xml:space="preserve">Seed.</w:t>
+      </w:r>
+      <w:r>
+        <w:rPr>
+          <w:rFonts w:ascii="Calibri" w:cs="Calibri" w:eastAsia="Calibri" w:hAnsi="Calibri"/>
+          <w:color w:val="1A1A1A"/>
+          <w:sz w:val="21"/>
+          <w:szCs w:val="21"/>
+        </w:rPr>
+        <w:t xml:space="preserve"> A rule that uses how a visitor arrived, before they have shown any interest: the campaign term, the arrival channel, the referring network or the operating system family of their phone. A seed adds an amount the brand publishes to matching pieces, lowered when the visitor's own audiences point elsewhere, and the visitor's own interests overtake it as they grow; seeds are published on the slots document.</w:t>
+      </w:r>
+    </w:p>
+    <w:p>
+      <w:pPr>
+        <w:spacing w:after="120" w:line="276"/>
+      </w:pPr>
+      <w:r>
+        <w:rPr>
+          <w:rFonts w:ascii="Calibri" w:cs="Calibri" w:eastAsia="Calibri" w:hAnsi="Calibri"/>
+          <w:b/>
+          <w:bCs/>
+          <w:color w:val="1A1A1A"/>
+          <w:sz w:val="21"/>
+          <w:szCs w:val="21"/>
+        </w:rPr>
+        <w:t xml:space="preserve">Segment.</w:t>
+      </w:r>
+      <w:r>
+        <w:rPr>
+          <w:rFonts w:ascii="Calibri" w:cs="Calibri" w:eastAsia="Calibri" w:hAnsi="Calibri"/>
+          <w:color w:val="1A1A1A"/>
+          <w:sz w:val="21"/>
+          <w:szCs w:val="21"/>
+        </w:rPr>
+        <w:t xml:space="preserve"> Deprecated: say audience.</w:t>
+      </w:r>
+    </w:p>
+    <w:p>
+      <w:pPr>
+        <w:spacing w:after="120" w:line="276"/>
+      </w:pPr>
+      <w:r>
+        <w:rPr>
+          <w:rFonts w:ascii="Calibri" w:cs="Calibri" w:eastAsia="Calibri" w:hAnsi="Calibri"/>
+          <w:b/>
+          <w:bCs/>
+          <w:color w:val="1A1A1A"/>
+          <w:sz w:val="21"/>
+          <w:szCs w:val="21"/>
+        </w:rPr>
+        <w:t xml:space="preserve">Session.</w:t>
+      </w:r>
+      <w:r>
+        <w:rPr>
+          <w:rFonts w:ascii="Calibri" w:cs="Calibri" w:eastAsia="Calibri" w:hAnsi="Calibri"/>
+          <w:color w:val="1A1A1A"/>
+          <w:sz w:val="21"/>
+          <w:szCs w:val="21"/>
+        </w:rPr>
+        <w:t xml:space="preserve"> The visitor's time on the site, which this package follows from before they arrive to after they leave. Engineers also use the word for the signed pass the visitor's browser presents, which lasts at most 24 hours; that pass is the shopper capability.</w:t>
+      </w:r>
+    </w:p>
+    <w:p>
+      <w:pPr>
+        <w:spacing w:after="120" w:line="276"/>
+      </w:pPr>
+      <w:r>
+        <w:rPr>
+          <w:rFonts w:ascii="Calibri" w:cs="Calibri" w:eastAsia="Calibri" w:hAnsi="Calibri"/>
+          <w:b/>
+          <w:bCs/>
+          <w:color w:val="1A1A1A"/>
+          <w:sz w:val="21"/>
+          <w:szCs w:val="21"/>
+        </w:rPr>
+        <w:t xml:space="preserve">Session host, object host.</w:t>
+      </w:r>
+      <w:r>
+        <w:rPr>
+          <w:rFonts w:ascii="Calibri" w:cs="Calibri" w:eastAsia="Calibri" w:hAnsi="Calibri"/>
+          <w:color w:val="1A1A1A"/>
+          <w:sz w:val="21"/>
+          <w:szCs w:val="21"/>
+        </w:rPr>
+        <w:t xml:space="preserve"> The two places a visitor's interests can live: a record in KV (the session host) or a Durable Object of their own (the object host).</w:t>
+      </w:r>
+    </w:p>
+    <w:p>
+      <w:pPr>
+        <w:spacing w:after="120" w:line="276"/>
+      </w:pPr>
+      <w:r>
+        <w:rPr>
+          <w:rFonts w:ascii="Calibri" w:cs="Calibri" w:eastAsia="Calibri" w:hAnsi="Calibri"/>
+          <w:b/>
+          <w:bCs/>
+          <w:color w:val="1A1A1A"/>
+          <w:sz w:val="21"/>
+          <w:szCs w:val="21"/>
+        </w:rPr>
+        <w:t xml:space="preserve">Shopper.</w:t>
+      </w:r>
+      <w:r>
+        <w:rPr>
+          <w:rFonts w:ascii="Calibri" w:cs="Calibri" w:eastAsia="Calibri" w:hAnsi="Calibri"/>
+          <w:color w:val="1A1A1A"/>
+          <w:sz w:val="21"/>
+          <w:szCs w:val="21"/>
+        </w:rPr>
+        <w:t xml:space="preserve"> The same person as a visitor. Say visitor, except in a retail example.</w:t>
+      </w:r>
+    </w:p>
+    <w:p>
+      <w:pPr>
+        <w:spacing w:after="120" w:line="276"/>
+      </w:pPr>
+      <w:r>
+        <w:rPr>
+          <w:rFonts w:ascii="Calibri" w:cs="Calibri" w:eastAsia="Calibri" w:hAnsi="Calibri"/>
+          <w:b/>
+          <w:bCs/>
+          <w:color w:val="1A1A1A"/>
+          <w:sz w:val="21"/>
+          <w:szCs w:val="21"/>
+        </w:rPr>
+        <w:t xml:space="preserve">Shopper capability.</w:t>
+      </w:r>
+      <w:r>
+        <w:rPr>
+          <w:rFonts w:ascii="Calibri" w:cs="Calibri" w:eastAsia="Calibri" w:hAnsi="Calibri"/>
+          <w:color w:val="1A1A1A"/>
+          <w:sz w:val="21"/>
+          <w:szCs w:val="21"/>
+        </w:rPr>
+        <w:t xml:space="preserve"> The signed, short-lived pass the engine gives a visitor's browser for one session, valid for at most 24 hours, which the browser shows on every call. Ids the caller makes up and old cookies grant nothing without it.</w:t>
+      </w:r>
+    </w:p>
+    <w:p>
+      <w:pPr>
+        <w:spacing w:after="120" w:line="276"/>
+      </w:pPr>
+      <w:r>
+        <w:rPr>
+          <w:rFonts w:ascii="Calibri" w:cs="Calibri" w:eastAsia="Calibri" w:hAnsi="Calibri"/>
+          <w:b/>
+          <w:bCs/>
+          <w:color w:val="1A1A1A"/>
+          <w:sz w:val="21"/>
+          <w:szCs w:val="21"/>
+        </w:rPr>
+        <w:t xml:space="preserve">Sign-in merge.</w:t>
+      </w:r>
+      <w:r>
+        <w:rPr>
+          <w:rFonts w:ascii="Calibri" w:cs="Calibri" w:eastAsia="Calibri" w:hAnsi="Calibri"/>
+          <w:color w:val="1A1A1A"/>
+          <w:sz w:val="21"/>
+          <w:szCs w:val="21"/>
+        </w:rPr>
+        <w:t xml:space="preserve"> What happens when a visitor signs in: the brand's own server signs a proof of who they are, and their anonymous and signed-in profiles merge, adding interests and overriding nothing. Their account id is never stored as such; they are known by a hash of it, salted on every customer deployment.</w:t>
+      </w:r>
+    </w:p>
+    <w:p>
+      <w:pPr>
+        <w:spacing w:after="120" w:line="276"/>
+      </w:pPr>
+      <w:r>
+        <w:rPr>
+          <w:rFonts w:ascii="Calibri" w:cs="Calibri" w:eastAsia="Calibri" w:hAnsi="Calibri"/>
+          <w:b/>
+          <w:bCs/>
+          <w:color w:val="1A1A1A"/>
+          <w:sz w:val="21"/>
+          <w:szCs w:val="21"/>
+        </w:rPr>
+        <w:t xml:space="preserve">Signal system.</w:t>
+      </w:r>
+      <w:r>
+        <w:rPr>
+          <w:rFonts w:ascii="Calibri" w:cs="Calibri" w:eastAsia="Calibri" w:hAnsi="Calibri"/>
+          <w:color w:val="1A1A1A"/>
+          <w:sz w:val="21"/>
+          <w:szCs w:val="21"/>
+        </w:rPr>
+        <w:t xml:space="preserve"> Deprecated: one demo's name for the engine. Say the engine.</w:t>
+      </w:r>
+    </w:p>
+    <w:p>
+      <w:pPr>
+        <w:spacing w:after="120" w:line="276"/>
+      </w:pPr>
+      <w:r>
+        <w:rPr>
+          <w:rFonts w:ascii="Calibri" w:cs="Calibri" w:eastAsia="Calibri" w:hAnsi="Calibri"/>
+          <w:b/>
+          <w:bCs/>
+          <w:color w:val="1A1A1A"/>
+          <w:sz w:val="21"/>
+          <w:szCs w:val="21"/>
+        </w:rPr>
+        <w:t xml:space="preserve">Site key.</w:t>
+      </w:r>
+      <w:r>
+        <w:rPr>
+          <w:rFonts w:ascii="Calibri" w:cs="Calibri" w:eastAsia="Calibri" w:hAnsi="Calibri"/>
+          <w:color w:val="1A1A1A"/>
+          <w:sz w:val="21"/>
+          <w:szCs w:val="21"/>
+        </w:rPr>
+        <w:t xml:space="preserve"> The key that identifies the brand's site on every call from its pages. It is not a secret; the engine checks that it belongs to the brand being called.</w:t>
+      </w:r>
+    </w:p>
+    <w:p>
+      <w:pPr>
+        <w:spacing w:after="120" w:line="276"/>
+      </w:pPr>
+      <w:r>
+        <w:rPr>
+          <w:rFonts w:ascii="Calibri" w:cs="Calibri" w:eastAsia="Calibri" w:hAnsi="Calibri"/>
+          <w:b/>
+          <w:bCs/>
+          <w:color w:val="1A1A1A"/>
+          <w:sz w:val="21"/>
+          <w:szCs w:val="21"/>
+        </w:rPr>
+        <w:t xml:space="preserve">Slot.</w:t>
+      </w:r>
+      <w:r>
+        <w:rPr>
+          <w:rFonts w:ascii="Calibri" w:cs="Calibri" w:eastAsia="Calibri" w:hAnsi="Calibri"/>
+          <w:color w:val="1A1A1A"/>
+          <w:sz w:val="21"/>
+          <w:szCs w:val="21"/>
+        </w:rPr>
+        <w:t xml:space="preserve"> One place on one page that the engine decides, showing one or more pieces in order. Older material says container, frame or zone; say slot.</w:t>
+      </w:r>
+    </w:p>
+    <w:p>
+      <w:pPr>
+        <w:spacing w:after="120" w:line="276"/>
+      </w:pPr>
+      <w:r>
+        <w:rPr>
+          <w:rFonts w:ascii="Calibri" w:cs="Calibri" w:eastAsia="Calibri" w:hAnsi="Calibri"/>
+          <w:b/>
+          <w:bCs/>
+          <w:color w:val="1A1A1A"/>
+          <w:sz w:val="21"/>
+          <w:szCs w:val="21"/>
+        </w:rPr>
+        <w:t xml:space="preserve">Slot weight (ω).</w:t>
+      </w:r>
+      <w:r>
+        <w:rPr>
+          <w:rFonts w:ascii="Calibri" w:cs="Calibri" w:eastAsia="Calibri" w:hAnsi="Calibri"/>
+          <w:color w:val="1A1A1A"/>
+          <w:sz w:val="21"/>
+          <w:szCs w:val="21"/>
+        </w:rPr>
+        <w:t xml:space="preserve"> How much a dimension counts in a slot, from 0 to 1, so one slot can favor brand and another category. The brand sets it in the slots document.</w:t>
+      </w:r>
+    </w:p>
+    <w:p>
+      <w:pPr>
+        <w:spacing w:after="120" w:line="276"/>
+      </w:pPr>
+      <w:r>
+        <w:rPr>
+          <w:rFonts w:ascii="Calibri" w:cs="Calibri" w:eastAsia="Calibri" w:hAnsi="Calibri"/>
+          <w:b/>
+          <w:bCs/>
+          <w:color w:val="1A1A1A"/>
+          <w:sz w:val="21"/>
+          <w:szCs w:val="21"/>
+        </w:rPr>
+        <w:t xml:space="preserve">Slots document.</w:t>
+      </w:r>
+      <w:r>
+        <w:rPr>
+          <w:rFonts w:ascii="Calibri" w:cs="Calibri" w:eastAsia="Calibri" w:hAnsi="Calibri"/>
+          <w:color w:val="1A1A1A"/>
+          <w:sz w:val="21"/>
+          <w:szCs w:val="21"/>
+        </w:rPr>
+        <w:t xml:space="preserve"> The published document that lists the brand's pages and their slots, with each slot's take, weights, pins, rules and arrival seeds.</w:t>
+      </w:r>
+    </w:p>
+    <w:p>
+      <w:pPr>
+        <w:spacing w:after="120" w:line="276"/>
+      </w:pPr>
+      <w:r>
+        <w:rPr>
+          <w:rFonts w:ascii="Calibri" w:cs="Calibri" w:eastAsia="Calibri" w:hAnsi="Calibri"/>
+          <w:b/>
+          <w:bCs/>
+          <w:color w:val="1A1A1A"/>
+          <w:sz w:val="21"/>
+          <w:szCs w:val="21"/>
+        </w:rPr>
+        <w:t xml:space="preserve">Stage.</w:t>
+      </w:r>
+      <w:r>
+        <w:rPr>
+          <w:rFonts w:ascii="Calibri" w:cs="Calibri" w:eastAsia="Calibri" w:hAnsi="Calibri"/>
+          <w:color w:val="1A1A1A"/>
+          <w:sz w:val="21"/>
+          <w:szCs w:val="21"/>
+        </w:rPr>
+        <w:t xml:space="preserve"> Deprecated on its own: say journey stage, the only stage in this package. Never call a part of learning, or a step in delivering the product, a stage.</w:t>
+      </w:r>
+    </w:p>
+    <w:p>
+      <w:pPr>
+        <w:spacing w:after="120" w:line="276"/>
+      </w:pPr>
+      <w:r>
+        <w:rPr>
+          <w:rFonts w:ascii="Calibri" w:cs="Calibri" w:eastAsia="Calibri" w:hAnsi="Calibri"/>
+          <w:b/>
+          <w:bCs/>
+          <w:color w:val="1A1A1A"/>
+          <w:sz w:val="21"/>
+          <w:szCs w:val="21"/>
+        </w:rPr>
+        <w:t xml:space="preserve">Stamp.</w:t>
+      </w:r>
+      <w:r>
+        <w:rPr>
+          <w:rFonts w:ascii="Calibri" w:cs="Calibri" w:eastAsia="Calibri" w:hAnsi="Calibri"/>
+          <w:color w:val="1A1A1A"/>
+          <w:sz w:val="21"/>
+          <w:szCs w:val="21"/>
+        </w:rPr>
+        <w:t xml:space="preserve"> Deprecated for readers: say customer deployment. It is the engineers' word for one: one Worker per environment, with its own storage.</w:t>
+      </w:r>
+    </w:p>
+    <w:p>
+      <w:pPr>
+        <w:spacing w:after="120" w:line="276"/>
+      </w:pPr>
+      <w:r>
+        <w:rPr>
+          <w:rFonts w:ascii="Calibri" w:cs="Calibri" w:eastAsia="Calibri" w:hAnsi="Calibri"/>
+          <w:b/>
+          <w:bCs/>
+          <w:color w:val="1A1A1A"/>
+          <w:sz w:val="21"/>
+          <w:szCs w:val="21"/>
+        </w:rPr>
+        <w:t xml:space="preserve">Synthetic.</w:t>
+      </w:r>
+      <w:r>
+        <w:rPr>
+          <w:rFonts w:ascii="Calibri" w:cs="Calibri" w:eastAsia="Calibri" w:hAnsi="Calibri"/>
+          <w:color w:val="1A1A1A"/>
+          <w:sz w:val="21"/>
+          <w:szCs w:val="21"/>
+        </w:rPr>
+        <w:t xml:space="preserve"> Made up for a demo and labeled as such on screen, such as the regional sales behind a demo's cold start. Synthetic data is never presented as a customer's own.</w:t>
       </w:r>
     </w:p>
     <w:p>
@@ -4154,7 +4048,7 @@
           <w:sz w:val="25"/>
           <w:szCs w:val="25"/>
         </w:rPr>
-        <w:t xml:space="preserve">V</w:t>
+        <w:t xml:space="preserve">T</w:t>
       </w:r>
       <w:bookmarkEnd w:id="20"/>
     </w:p>
@@ -4171,66 +4065,141 @@
           <w:sz w:val="21"/>
           <w:szCs w:val="21"/>
         </w:rPr>
-        <w:t xml:space="preserve">Visit.</w:t>
-      </w:r>
-      <w:r>
-        <w:rPr>
-          <w:rFonts w:ascii="Calibri" w:cs="Calibri" w:eastAsia="Calibri" w:hAnsi="Calibri"/>
-          <w:color w:val="1A1A1A"/>
-          <w:sz w:val="21"/>
-          <w:szCs w:val="21"/>
-        </w:rPr>
-        <w:t xml:space="preserve"> A run of activity with no gap of 30 minutes or more; a longer gap starts a new visit. Journey stage is counted per visit.</w:t>
-      </w:r>
-    </w:p>
-    <w:p>
-      <w:pPr>
-        <w:spacing w:after="120" w:line="276"/>
-      </w:pPr>
-      <w:r>
-        <w:rPr>
-          <w:rFonts w:ascii="Calibri" w:cs="Calibri" w:eastAsia="Calibri" w:hAnsi="Calibri"/>
-          <w:b/>
-          <w:bCs/>
-          <w:color w:val="1A1A1A"/>
-          <w:sz w:val="21"/>
-          <w:szCs w:val="21"/>
-        </w:rPr>
-        <w:t xml:space="preserve">Visit band.</w:t>
-      </w:r>
-      <w:r>
-        <w:rPr>
-          <w:rFonts w:ascii="Calibri" w:cs="Calibri" w:eastAsia="Calibri" w:hAnsi="Calibri"/>
-          <w:color w:val="1A1A1A"/>
-          <w:sz w:val="21"/>
-          <w:szCs w:val="21"/>
-        </w:rPr>
-        <w:t xml:space="preserve"> How many visits a visitor has made, grouped as first, second or third, and fourth or later; it is part of a decision's context. Older material calls it the visit bucket.</w:t>
-      </w:r>
-    </w:p>
-    <w:p>
-      <w:pPr>
-        <w:spacing w:after="120" w:line="276"/>
-      </w:pPr>
-      <w:r>
-        <w:rPr>
-          <w:rFonts w:ascii="Calibri" w:cs="Calibri" w:eastAsia="Calibri" w:hAnsi="Calibri"/>
-          <w:b/>
-          <w:bCs/>
-          <w:color w:val="1A1A1A"/>
-          <w:sz w:val="21"/>
-          <w:szCs w:val="21"/>
-        </w:rPr>
-        <w:t xml:space="preserve">Visitor.</w:t>
-      </w:r>
-      <w:r>
-        <w:rPr>
-          <w:rFonts w:ascii="Calibri" w:cs="Calibri" w:eastAsia="Calibri" w:hAnsi="Calibri"/>
-          <w:color w:val="1A1A1A"/>
-          <w:sz w:val="21"/>
-          <w:szCs w:val="21"/>
-        </w:rPr>
-        <w:t xml:space="preserve"> A person on the site, known to the engine only by a random id until they sign in. Visitor is this package's word; shopper means the same person in retail examples.</w:t>
+        <w:t xml:space="preserve">Tag.</w:t>
+      </w:r>
+      <w:r>
+        <w:rPr>
+          <w:rFonts w:ascii="Calibri" w:cs="Calibri" w:eastAsia="Calibri" w:hAnsi="Calibri"/>
+          <w:color w:val="1A1A1A"/>
+          <w:sz w:val="21"/>
+          <w:szCs w:val="21"/>
+        </w:rPr>
+        <w:t xml:space="preserve"> A dimension value written on a piece, such as brand: samsung, so the engine can score the piece against a visitor's interests. Tags use the registry's vocabulary.</w:t>
+      </w:r>
+    </w:p>
+    <w:p>
+      <w:pPr>
+        <w:spacing w:after="120" w:line="276"/>
+      </w:pPr>
+      <w:r>
+        <w:rPr>
+          <w:rFonts w:ascii="Calibri" w:cs="Calibri" w:eastAsia="Calibri" w:hAnsi="Calibri"/>
+          <w:b/>
+          <w:bCs/>
+          <w:color w:val="1A1A1A"/>
+          <w:sz w:val="21"/>
+          <w:szCs w:val="21"/>
+        </w:rPr>
+        <w:t xml:space="preserve">Take.</w:t>
+      </w:r>
+      <w:r>
+        <w:rPr>
+          <w:rFonts w:ascii="Calibri" w:cs="Calibri" w:eastAsia="Calibri" w:hAnsi="Calibri"/>
+          <w:color w:val="1A1A1A"/>
+          <w:sz w:val="21"/>
+          <w:szCs w:val="21"/>
+        </w:rPr>
+        <w:t xml:space="preserve"> How many pieces a slot shows, from 1 to 50.</w:t>
+      </w:r>
+    </w:p>
+    <w:p>
+      <w:pPr>
+        <w:spacing w:after="120" w:line="276"/>
+      </w:pPr>
+      <w:r>
+        <w:rPr>
+          <w:rFonts w:ascii="Calibri" w:cs="Calibri" w:eastAsia="Calibri" w:hAnsi="Calibri"/>
+          <w:b/>
+          <w:bCs/>
+          <w:color w:val="1A1A1A"/>
+          <w:sz w:val="21"/>
+          <w:szCs w:val="21"/>
+        </w:rPr>
+        <w:t xml:space="preserve">Tenant.</w:t>
+      </w:r>
+      <w:r>
+        <w:rPr>
+          <w:rFonts w:ascii="Calibri" w:cs="Calibri" w:eastAsia="Calibri" w:hAnsi="Calibri"/>
+          <w:color w:val="1A1A1A"/>
+          <w:sz w:val="21"/>
+          <w:szCs w:val="21"/>
+        </w:rPr>
+        <w:t xml:space="preserve"> One brand's isolated space inside a deployment: everything it owns is kept under its own prefix, and nothing pools across brands. Engineers declare a deployment's tenants, and a page names its tenant on every call.</w:t>
+      </w:r>
+    </w:p>
+    <w:p>
+      <w:pPr>
+        <w:spacing w:after="120" w:line="276"/>
+      </w:pPr>
+      <w:r>
+        <w:rPr>
+          <w:rFonts w:ascii="Calibri" w:cs="Calibri" w:eastAsia="Calibri" w:hAnsi="Calibri"/>
+          <w:b/>
+          <w:bCs/>
+          <w:color w:val="1A1A1A"/>
+          <w:sz w:val="21"/>
+          <w:szCs w:val="21"/>
+        </w:rPr>
+        <w:t xml:space="preserve">Touch.</w:t>
+      </w:r>
+      <w:r>
+        <w:rPr>
+          <w:rFonts w:ascii="Calibri" w:cs="Calibri" w:eastAsia="Calibri" w:hAnsi="Calibri"/>
+          <w:color w:val="1A1A1A"/>
+          <w:sz w:val="21"/>
+          <w:szCs w:val="21"/>
+        </w:rPr>
+        <w:t xml:space="preserve"> One hit on one dimension value that an event produces: a single product view can touch its brand, its category and its price band at once. Each touch adds the action's weight to that value's raw score.</w:t>
+      </w:r>
+    </w:p>
+    <w:p>
+      <w:pPr>
+        <w:spacing w:after="120" w:line="276"/>
+      </w:pPr>
+      <w:r>
+        <w:rPr>
+          <w:rFonts w:ascii="Calibri" w:cs="Calibri" w:eastAsia="Calibri" w:hAnsi="Calibri"/>
+          <w:b/>
+          <w:bCs/>
+          <w:color w:val="1A1A1A"/>
+          <w:sz w:val="21"/>
+          <w:szCs w:val="21"/>
+        </w:rPr>
+        <w:t xml:space="preserve">Trust dial.</w:t>
+      </w:r>
+      <w:r>
+        <w:rPr>
+          <w:rFonts w:ascii="Calibri" w:cs="Calibri" w:eastAsia="Calibri" w:hAnsi="Calibri"/>
+          <w:color w:val="1A1A1A"/>
+          <w:sz w:val="21"/>
+          <w:szCs w:val="21"/>
+        </w:rPr>
+        <w:t xml:space="preserve"> Deprecated: say learning dial.</w:t>
+      </w:r>
+    </w:p>
+    <w:p>
+      <w:pPr>
+        <w:spacing w:after="120" w:line="276"/>
+      </w:pPr>
+      <w:r>
+        <w:rPr>
+          <w:rFonts w:ascii="Calibri" w:cs="Calibri" w:eastAsia="Calibri" w:hAnsi="Calibri"/>
+          <w:b/>
+          <w:bCs/>
+          <w:color w:val="1A1A1A"/>
+          <w:sz w:val="21"/>
+          <w:szCs w:val="21"/>
+        </w:rPr>
+        <w:t xml:space="preserve">Typed search.</w:t>
+      </w:r>
+      <w:r>
+        <w:rPr>
+          <w:rFonts w:ascii="Calibri" w:cs="Calibri" w:eastAsia="Calibri" w:hAnsi="Calibri"/>
+          <w:color w:val="1A1A1A"/>
+          <w:sz w:val="21"/>
+          <w:szCs w:val="21"/>
+        </w:rPr>
+        <w:t xml:space="preserve"> Search in which an AI model reads what the visitor types, the brand's catalog search fetches results, and the engine ranks them for that visitor; also called AI search. It is one of the optional AI add-ons, outside the decision, which a brand switches on with its credits.</w:t>
       </w:r>
     </w:p>
     <w:p>
@@ -4248,9 +4217,103 @@
           <w:sz w:val="25"/>
           <w:szCs w:val="25"/>
         </w:rPr>
+        <w:t xml:space="preserve">V</w:t>
+      </w:r>
+      <w:bookmarkEnd w:id="21"/>
+    </w:p>
+    <w:p>
+      <w:pPr>
+        <w:spacing w:after="120" w:line="276"/>
+      </w:pPr>
+      <w:r>
+        <w:rPr>
+          <w:rFonts w:ascii="Calibri" w:cs="Calibri" w:eastAsia="Calibri" w:hAnsi="Calibri"/>
+          <w:b/>
+          <w:bCs/>
+          <w:color w:val="1A1A1A"/>
+          <w:sz w:val="21"/>
+          <w:szCs w:val="21"/>
+        </w:rPr>
+        <w:t xml:space="preserve">Visit.</w:t>
+      </w:r>
+      <w:r>
+        <w:rPr>
+          <w:rFonts w:ascii="Calibri" w:cs="Calibri" w:eastAsia="Calibri" w:hAnsi="Calibri"/>
+          <w:color w:val="1A1A1A"/>
+          <w:sz w:val="21"/>
+          <w:szCs w:val="21"/>
+        </w:rPr>
+        <w:t xml:space="preserve"> A run of activity with no gap of 30 minutes or more; a longer gap starts a new visit. Journey stage is counted per visit.</w:t>
+      </w:r>
+    </w:p>
+    <w:p>
+      <w:pPr>
+        <w:spacing w:after="120" w:line="276"/>
+      </w:pPr>
+      <w:r>
+        <w:rPr>
+          <w:rFonts w:ascii="Calibri" w:cs="Calibri" w:eastAsia="Calibri" w:hAnsi="Calibri"/>
+          <w:b/>
+          <w:bCs/>
+          <w:color w:val="1A1A1A"/>
+          <w:sz w:val="21"/>
+          <w:szCs w:val="21"/>
+        </w:rPr>
+        <w:t xml:space="preserve">Visit band.</w:t>
+      </w:r>
+      <w:r>
+        <w:rPr>
+          <w:rFonts w:ascii="Calibri" w:cs="Calibri" w:eastAsia="Calibri" w:hAnsi="Calibri"/>
+          <w:color w:val="1A1A1A"/>
+          <w:sz w:val="21"/>
+          <w:szCs w:val="21"/>
+        </w:rPr>
+        <w:t xml:space="preserve"> How many visits a visitor has made, grouped as first, second or third, and fourth or later; it is part of a decision's context. Older material calls it the visit bucket.</w:t>
+      </w:r>
+    </w:p>
+    <w:p>
+      <w:pPr>
+        <w:spacing w:after="120" w:line="276"/>
+      </w:pPr>
+      <w:r>
+        <w:rPr>
+          <w:rFonts w:ascii="Calibri" w:cs="Calibri" w:eastAsia="Calibri" w:hAnsi="Calibri"/>
+          <w:b/>
+          <w:bCs/>
+          <w:color w:val="1A1A1A"/>
+          <w:sz w:val="21"/>
+          <w:szCs w:val="21"/>
+        </w:rPr>
+        <w:t xml:space="preserve">Visitor.</w:t>
+      </w:r>
+      <w:r>
+        <w:rPr>
+          <w:rFonts w:ascii="Calibri" w:cs="Calibri" w:eastAsia="Calibri" w:hAnsi="Calibri"/>
+          <w:color w:val="1A1A1A"/>
+          <w:sz w:val="21"/>
+          <w:szCs w:val="21"/>
+        </w:rPr>
+        <w:t xml:space="preserve"> A person on the site, known to the engine only by a random id until they sign in. Visitor is this package's word; shopper means the same person in retail examples.</w:t>
+      </w:r>
+    </w:p>
+    <w:p>
+      <w:pPr>
+        <w:pStyle w:val="Heading2"/>
+        <w:spacing w:after="160" w:before="320"/>
+      </w:pPr>
+      <w:bookmarkStart w:name="sec22" w:id="22"/>
+      <w:r>
+        <w:rPr>
+          <w:rFonts w:ascii="Calibri" w:cs="Calibri" w:eastAsia="Calibri" w:hAnsi="Calibri"/>
+          <w:b/>
+          <w:bCs/>
+          <w:color w:val="0B5CAD"/>
+          <w:sz w:val="25"/>
+          <w:szCs w:val="25"/>
+        </w:rPr>
         <w:t xml:space="preserve">W</w:t>
       </w:r>
-      <w:bookmarkEnd w:id="21"/>
+      <w:bookmarkEnd w:id="22"/>
     </w:p>
     <w:p>
       <w:pPr>

</xml_diff>